<commit_message>
client update and mods/specs
</commit_message>
<xml_diff>
--- a/files/Pres_Template.docx
+++ b/files/Pres_Template.docx
@@ -3,6 +3,1070 @@
 <w:document xmlns:wpc="http://schemas.microsoft.com/office/word/2010/wordprocessingCanvas" xmlns:cx="http://schemas.microsoft.com/office/drawing/2014/chartex" xmlns:cx1="http://schemas.microsoft.com/office/drawing/2015/9/8/chartex" xmlns:cx2="http://schemas.microsoft.com/office/drawing/2015/10/21/chartex" xmlns:cx3="http://schemas.microsoft.com/office/drawing/2016/5/9/chartex" xmlns:cx4="http://schemas.microsoft.com/office/drawing/2016/5/10/chartex" xmlns:cx5="http://schemas.microsoft.com/office/drawing/2016/5/11/chartex" xmlns:cx6="http://schemas.microsoft.com/office/drawing/2016/5/12/chartex" xmlns:cx7="http://schemas.microsoft.com/office/drawing/2016/5/13/chartex" xmlns:cx8="http://schemas.microsoft.com/office/drawing/2016/5/14/chartex" xmlns:mc="http://schemas.openxmlformats.org/markup-compatibility/2006" xmlns:aink="http://schemas.microsoft.com/office/drawing/2016/ink" xmlns:am3d="http://schemas.microsoft.com/office/drawing/2017/model3d" xmlns:o="urn:schemas-microsoft-com:office:office" xmlns:oel="http://schemas.microsoft.com/office/2019/extlst" xmlns:r="http://schemas.openxmlformats.org/officeDocument/2006/relationships" xmlns:m="http://schemas.openxmlformats.org/officeDocument/2006/math" xmlns:v="urn:schemas-microsoft-com:vml" xmlns:wp14="http://schemas.microsoft.com/office/word/2010/wordprocessingDrawing" xmlns:wp="http://schemas.openxmlformats.org/drawingml/2006/wordprocessingDrawing" xmlns:w10="urn:schemas-microsoft-com:office:word" xmlns:w="http://schemas.openxmlformats.org/wordprocessingml/2006/main" xmlns:w14="http://schemas.microsoft.com/office/word/2010/wordml" xmlns:w15="http://schemas.microsoft.com/office/word/2012/wordml" xmlns:w16cex="http://schemas.microsoft.com/office/word/2018/wordml/cex" xmlns:w16cid="http://schemas.microsoft.com/office/word/2016/wordml/cid" xmlns:w16="http://schemas.microsoft.com/office/word/2018/wordml" xmlns:w16du="http://schemas.microsoft.com/office/word/2023/wordml/word16du" xmlns:w16sdtdh="http://schemas.microsoft.com/office/word/2020/wordml/sdtdatahash" xmlns:w16sdtfl="http://schemas.microsoft.com/office/word/2024/wordml/sdtformatlock" xmlns:w16se="http://schemas.microsoft.com/office/word/2015/wordml/symex" xmlns:wpg="http://schemas.microsoft.com/office/word/2010/wordprocessingGroup" xmlns:wpi="http://schemas.microsoft.com/office/word/2010/wordprocessingInk" xmlns:wne="http://schemas.microsoft.com/office/word/2006/wordml" xmlns:wps="http://schemas.microsoft.com/office/word/2010/wordprocessingShape" mc:Ignorable="w14 w15 w16se w16cid w16 w16cex w16sdtdh w16sdtfl w16du wp14">
   <w:body>
     <w:p>
+      <w:r>
+        <w:rPr>
+          <w:noProof/>
+        </w:rPr>
+        <w:drawing>
+          <wp:anchor distT="0" distB="0" distL="114300" distR="114300" simplePos="0" relativeHeight="251662336" behindDoc="0" locked="0" layoutInCell="1" allowOverlap="1" wp14:anchorId="75DB1D37" wp14:editId="51484FAB">
+            <wp:simplePos x="0" y="0"/>
+            <wp:positionH relativeFrom="column">
+              <wp:posOffset>2183792</wp:posOffset>
+            </wp:positionH>
+            <wp:positionV relativeFrom="page">
+              <wp:posOffset>1286179</wp:posOffset>
+            </wp:positionV>
+            <wp:extent cx="162560" cy="162560"/>
+            <wp:effectExtent l="0" t="0" r="8890" b="8890"/>
+            <wp:wrapTopAndBottom/>
+            <wp:docPr id="1265685533" name="Gráfico 3" descr="Teléfono"/>
+            <wp:cNvGraphicFramePr>
+              <a:graphicFrameLocks xmlns:a="http://schemas.openxmlformats.org/drawingml/2006/main" noChangeAspect="1"/>
+            </wp:cNvGraphicFramePr>
+            <a:graphic xmlns:a="http://schemas.openxmlformats.org/drawingml/2006/main">
+              <a:graphicData uri="http://schemas.openxmlformats.org/drawingml/2006/picture">
+                <pic:pic xmlns:pic="http://schemas.openxmlformats.org/drawingml/2006/picture">
+                  <pic:nvPicPr>
+                    <pic:cNvPr id="1265685533" name="Gráfico 1265685533" descr="Teléfono"/>
+                    <pic:cNvPicPr/>
+                  </pic:nvPicPr>
+                  <pic:blipFill>
+                    <a:blip r:embed="rId6">
+                      <a:extLst>
+                        <a:ext uri="{96DAC541-7B7A-43D3-8B79-37D633B846F1}">
+                          <asvg:svgBlip xmlns:asvg="http://schemas.microsoft.com/office/drawing/2016/SVG/main" r:embed="rId7"/>
+                        </a:ext>
+                      </a:extLst>
+                    </a:blip>
+                    <a:stretch>
+                      <a:fillRect/>
+                    </a:stretch>
+                  </pic:blipFill>
+                  <pic:spPr>
+                    <a:xfrm>
+                      <a:off x="0" y="0"/>
+                      <a:ext cx="162560" cy="162560"/>
+                    </a:xfrm>
+                    <a:prstGeom prst="rect">
+                      <a:avLst/>
+                    </a:prstGeom>
+                  </pic:spPr>
+                </pic:pic>
+              </a:graphicData>
+            </a:graphic>
+            <wp14:sizeRelH relativeFrom="margin">
+              <wp14:pctWidth>0</wp14:pctWidth>
+            </wp14:sizeRelH>
+            <wp14:sizeRelV relativeFrom="margin">
+              <wp14:pctHeight>0</wp14:pctHeight>
+            </wp14:sizeRelV>
+          </wp:anchor>
+        </w:drawing>
+      </w:r>
+      <w:r>
+        <w:rPr>
+          <w:noProof/>
+        </w:rPr>
+        <mc:AlternateContent>
+          <mc:Choice Requires="wps">
+            <w:drawing>
+              <wp:anchor distT="45720" distB="45720" distL="114300" distR="114300" simplePos="0" relativeHeight="251661312" behindDoc="0" locked="0" layoutInCell="1" allowOverlap="1" wp14:anchorId="13212A58" wp14:editId="0E264704">
+                <wp:simplePos x="0" y="0"/>
+                <wp:positionH relativeFrom="column">
+                  <wp:posOffset>1742440</wp:posOffset>
+                </wp:positionH>
+                <wp:positionV relativeFrom="page">
+                  <wp:posOffset>325755</wp:posOffset>
+                </wp:positionV>
+                <wp:extent cx="1852295" cy="1452245"/>
+                <wp:effectExtent l="0" t="0" r="14605" b="14605"/>
+                <wp:wrapThrough wrapText="bothSides">
+                  <wp:wrapPolygon edited="0">
+                    <wp:start x="0" y="0"/>
+                    <wp:lineTo x="0" y="21534"/>
+                    <wp:lineTo x="21548" y="21534"/>
+                    <wp:lineTo x="21548" y="0"/>
+                    <wp:lineTo x="0" y="0"/>
+                  </wp:wrapPolygon>
+                </wp:wrapThrough>
+                <wp:docPr id="1801446025" name="Cuadro de texto 2"/>
+                <wp:cNvGraphicFramePr>
+                  <a:graphicFrameLocks xmlns:a="http://schemas.openxmlformats.org/drawingml/2006/main"/>
+                </wp:cNvGraphicFramePr>
+                <a:graphic xmlns:a="http://schemas.openxmlformats.org/drawingml/2006/main">
+                  <a:graphicData uri="http://schemas.microsoft.com/office/word/2010/wordprocessingShape">
+                    <wps:wsp>
+                      <wps:cNvSpPr txBox="1">
+                        <a:spLocks noChangeArrowheads="1"/>
+                      </wps:cNvSpPr>
+                      <wps:spPr bwMode="auto">
+                        <a:xfrm>
+                          <a:off x="0" y="0"/>
+                          <a:ext cx="1852295" cy="1452245"/>
+                        </a:xfrm>
+                        <a:prstGeom prst="rect">
+                          <a:avLst/>
+                        </a:prstGeom>
+                        <a:ln>
+                          <a:solidFill>
+                            <a:schemeClr val="bg1"/>
+                          </a:solidFill>
+                          <a:headEnd/>
+                          <a:tailEnd/>
+                        </a:ln>
+                      </wps:spPr>
+                      <wps:style>
+                        <a:lnRef idx="2">
+                          <a:schemeClr val="dk1"/>
+                        </a:lnRef>
+                        <a:fillRef idx="1">
+                          <a:schemeClr val="lt1"/>
+                        </a:fillRef>
+                        <a:effectRef idx="0">
+                          <a:schemeClr val="dk1"/>
+                        </a:effectRef>
+                        <a:fontRef idx="minor">
+                          <a:schemeClr val="dk1"/>
+                        </a:fontRef>
+                      </wps:style>
+                      <wps:txbx>
+                        <w:txbxContent>
+                          <w:p>
+                            <w:pPr>
+                              <w:spacing w:line="240" w:lineRule="auto"/>
+                              <w:jc w:val="center"/>
+                              <w:rPr>
+                                <w:rFonts w:ascii="Aptos Display" w:hAnsi="Aptos Display"/>
+                              </w:rPr>
+                            </w:pPr>
+                            <w:r>
+                              <w:rPr>
+                                <w:rFonts w:ascii="Aptos Display" w:hAnsi="Aptos Display"/>
+                                <w:b/>
+                                <w:bCs/>
+                                <w:i/>
+                                <w:iCs/>
+                              </w:rPr>
+                              <w:t>SERVICE DE MOTOS Y CUATRICICLOS</w:t>
+                            </w:r>
+                            <w:r>
+                              <w:rPr>
+                                <w:rFonts w:ascii="Aptos Display" w:hAnsi="Aptos Display"/>
+                                <w:b/>
+                                <w:bCs/>
+                                <w:i/>
+                                <w:iCs/>
+                              </w:rPr>
+                              <w:br/>
+                            </w:r>
+                            <w:r>
+                              <w:rPr>
+                                <w:rFonts w:ascii="Aptos Display" w:hAnsi="Aptos Display"/>
+                                <w:b/>
+                                <w:bCs/>
+                                <w:i/>
+                                <w:iCs/>
+                                <w:sz w:val="16"/>
+                                <w:szCs w:val="16"/>
+                              </w:rPr>
+                              <w:br/>
+                            </w:r>
+                            <w:r>
+                              <w:rPr>
+                                <w:rFonts w:ascii="Aptos Display" w:hAnsi="Aptos Display"/>
+                                <w:sz w:val="18"/>
+                                <w:szCs w:val="18"/>
+                              </w:rPr>
+                              <w:t>Crisologo Larralde 179</w:t>
+                            </w:r>
+                            <w:r>
+                              <w:rPr>
+                                <w:rFonts w:ascii="Aptos Display" w:hAnsi="Aptos Display"/>
+                                <w:sz w:val="16"/>
+                                <w:szCs w:val="16"/>
+                              </w:rPr>
+                              <w:br/>
+                              <w:t>Piñeiro, Avellaneda – Provincia de Bs. As</w:t>
+                            </w:r>
+                            <w:r>
+                              <w:rPr>
+                                <w:rFonts w:ascii="Aptos Display" w:hAnsi="Aptos Display"/>
+                              </w:rPr>
+                              <w:br/>
+                            </w:r>
+                            <w:r>
+                              <w:rPr>
+                                <w:rFonts w:ascii="Aptos Display" w:hAnsi="Aptos Display"/>
+                              </w:rPr>
+                              <w:br/>
+                              <w:t>2148-5227</w:t>
+                            </w:r>
+                            <w:r>
+                              <w:rPr>
+                                <w:rFonts w:ascii="Aptos Display" w:hAnsi="Aptos Display"/>
+                              </w:rPr>
+                              <w:br/>
+                            </w:r>
+                            <w:r>
+                              <w:rPr>
+                                <w:rFonts w:ascii="Aptos Display" w:hAnsi="Aptos Display"/>
+                                <w:b/>
+                                <w:bCs/>
+                                <w:i/>
+                                <w:iCs/>
+                                <w:sz w:val="20"/>
+                                <w:szCs w:val="20"/>
+                              </w:rPr>
+                              <w:t>taller1028@hotmail.com</w:t>
+                            </w:r>
+                          </w:p>
+                        </w:txbxContent>
+                      </wps:txbx>
+                      <wps:bodyPr rot="0" vert="horz" wrap="square" lIns="91440" tIns="45720" rIns="91440" bIns="45720" anchor="t" anchorCtr="0">
+                        <a:noAutofit/>
+                      </wps:bodyPr>
+                    </wps:wsp>
+                  </a:graphicData>
+                </a:graphic>
+                <wp14:sizeRelH relativeFrom="margin">
+                  <wp14:pctWidth>0</wp14:pctWidth>
+                </wp14:sizeRelH>
+                <wp14:sizeRelV relativeFrom="margin">
+                  <wp14:pctHeight>0</wp14:pctHeight>
+                </wp14:sizeRelV>
+              </wp:anchor>
+            </w:drawing>
+          </mc:Choice>
+          <mc:Fallback>
+            <w:pict>
+              <v:shapetype w14:anchorId="13212A58" id="_x0000_t202" coordsize="21600,21600" o:spt="202" path="m,l,21600r21600,l21600,xe">
+                <v:stroke joinstyle="miter"/>
+                <v:path gradientshapeok="t" o:connecttype="rect"/>
+              </v:shapetype>
+              <v:shape id="Cuadro de texto 2" o:spid="_x0000_s1026" type="#_x0000_t202" style="position:absolute;margin-left:137.2pt;margin-top:25.65pt;width:145.85pt;height:114.35pt;z-index:251661312;visibility:visible;mso-wrap-style:square;mso-width-percent:0;mso-height-percent:0;mso-wrap-distance-left:9pt;mso-wrap-distance-top:3.6pt;mso-wrap-distance-right:9pt;mso-wrap-distance-bottom:3.6pt;mso-position-horizontal:absolute;mso-position-horizontal-relative:text;mso-position-vertical:absolute;mso-position-vertical-relative:page;mso-width-percent:0;mso-height-percent:0;mso-width-relative:margin;mso-height-relative:margin;v-text-anchor:top" o:gfxdata="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" fillcolor="white [3201]" strokecolor="white [3212]" strokeweight="1pt">
+                <v:textbox>
+                  <w:txbxContent>
+                    <w:p>
+                      <w:pPr>
+                        <w:spacing w:line="240" w:lineRule="auto"/>
+                        <w:jc w:val="center"/>
+                        <w:rPr>
+                          <w:rFonts w:ascii="Aptos Display" w:hAnsi="Aptos Display"/>
+                        </w:rPr>
+                      </w:pPr>
+                      <w:r>
+                        <w:rPr>
+                          <w:rFonts w:ascii="Aptos Display" w:hAnsi="Aptos Display"/>
+                          <w:b/>
+                          <w:bCs/>
+                          <w:i/>
+                          <w:iCs/>
+                        </w:rPr>
+                        <w:t>SERVICE DE MOTOS Y CUATRICICLOS</w:t>
+                      </w:r>
+                      <w:r>
+                        <w:rPr>
+                          <w:rFonts w:ascii="Aptos Display" w:hAnsi="Aptos Display"/>
+                          <w:b/>
+                          <w:bCs/>
+                          <w:i/>
+                          <w:iCs/>
+                        </w:rPr>
+                        <w:br/>
+                      </w:r>
+                      <w:r>
+                        <w:rPr>
+                          <w:rFonts w:ascii="Aptos Display" w:hAnsi="Aptos Display"/>
+                          <w:b/>
+                          <w:bCs/>
+                          <w:i/>
+                          <w:iCs/>
+                          <w:sz w:val="16"/>
+                          <w:szCs w:val="16"/>
+                        </w:rPr>
+                        <w:br/>
+                      </w:r>
+                      <w:r>
+                        <w:rPr>
+                          <w:rFonts w:ascii="Aptos Display" w:hAnsi="Aptos Display"/>
+                          <w:sz w:val="18"/>
+                          <w:szCs w:val="18"/>
+                        </w:rPr>
+                        <w:t>Crisologo Larralde 179</w:t>
+                      </w:r>
+                      <w:r>
+                        <w:rPr>
+                          <w:rFonts w:ascii="Aptos Display" w:hAnsi="Aptos Display"/>
+                          <w:sz w:val="16"/>
+                          <w:szCs w:val="16"/>
+                        </w:rPr>
+                        <w:br/>
+                        <w:t>Piñeiro, Avellaneda – Provincia de Bs. As</w:t>
+                      </w:r>
+                      <w:r>
+                        <w:rPr>
+                          <w:rFonts w:ascii="Aptos Display" w:hAnsi="Aptos Display"/>
+                        </w:rPr>
+                        <w:br/>
+                      </w:r>
+                      <w:r>
+                        <w:rPr>
+                          <w:rFonts w:ascii="Aptos Display" w:hAnsi="Aptos Display"/>
+                        </w:rPr>
+                        <w:br/>
+                        <w:t>2148-5227</w:t>
+                      </w:r>
+                      <w:r>
+                        <w:rPr>
+                          <w:rFonts w:ascii="Aptos Display" w:hAnsi="Aptos Display"/>
+                        </w:rPr>
+                        <w:br/>
+                      </w:r>
+                      <w:r>
+                        <w:rPr>
+                          <w:rFonts w:ascii="Aptos Display" w:hAnsi="Aptos Display"/>
+                          <w:b/>
+                          <w:bCs/>
+                          <w:i/>
+                          <w:iCs/>
+                          <w:sz w:val="20"/>
+                          <w:szCs w:val="20"/>
+                        </w:rPr>
+                        <w:t>taller1028@hotmail.com</w:t>
+                      </w:r>
+                    </w:p>
+                  </w:txbxContent>
+                </v:textbox>
+                <w10:wrap type="through" anchory="page"/>
+              </v:shape>
+            </w:pict>
+          </mc:Fallback>
+        </mc:AlternateContent>
+      </w:r>
+      <w:r>
+        <w:rPr>
+          <w:noProof/>
+        </w:rPr>
+        <mc:AlternateContent>
+          <mc:Choice Requires="wps">
+            <w:drawing>
+              <wp:anchor distT="45720" distB="45720" distL="114300" distR="114300" simplePos="0" relativeHeight="251666432" behindDoc="0" locked="0" layoutInCell="1" allowOverlap="1" wp14:anchorId="18848D1E" wp14:editId="236C2E8E">
+                <wp:simplePos x="0" y="0"/>
+                <wp:positionH relativeFrom="page">
+                  <wp:posOffset>4571393</wp:posOffset>
+                </wp:positionH>
+                <wp:positionV relativeFrom="topMargin">
+                  <wp:posOffset>418741</wp:posOffset>
+                </wp:positionV>
+                <wp:extent cx="385445" cy="409575"/>
+                <wp:effectExtent l="0" t="0" r="33655" b="47625"/>
+                <wp:wrapSquare wrapText="bothSides"/>
+                <wp:docPr id="1517717947" name="Cuadro de texto 2"/>
+                <wp:cNvGraphicFramePr>
+                  <a:graphicFrameLocks xmlns:a="http://schemas.openxmlformats.org/drawingml/2006/main"/>
+                </wp:cNvGraphicFramePr>
+                <a:graphic xmlns:a="http://schemas.openxmlformats.org/drawingml/2006/main">
+                  <a:graphicData uri="http://schemas.microsoft.com/office/word/2010/wordprocessingShape">
+                    <wps:wsp>
+                      <wps:cNvSpPr txBox="1">
+                        <a:spLocks noChangeArrowheads="1"/>
+                      </wps:cNvSpPr>
+                      <wps:spPr bwMode="auto">
+                        <a:xfrm>
+                          <a:off x="0" y="0"/>
+                          <a:ext cx="385445" cy="409575"/>
+                        </a:xfrm>
+                        <a:prstGeom prst="rect">
+                          <a:avLst/>
+                        </a:prstGeom>
+                        <a:solidFill>
+                          <a:srgbClr val="FFFFFF"/>
+                        </a:solidFill>
+                        <a:ln w="9525">
+                          <a:solidFill>
+                            <a:srgbClr val="000000"/>
+                          </a:solidFill>
+                          <a:miter lim="800000"/>
+                          <a:headEnd/>
+                          <a:tailEnd/>
+                        </a:ln>
+                        <a:effectLst>
+                          <a:outerShdw dist="25400" dir="2520000" algn="tl" rotWithShape="0">
+                            <a:prstClr val="black"/>
+                          </a:outerShdw>
+                        </a:effectLst>
+                      </wps:spPr>
+                      <wps:txbx>
+                        <w:txbxContent>
+                          <w:p>
+                            <w:pPr>
+                              <w:rPr>
+                                <w:b/>
+                                <w:bCs/>
+                                <w:sz w:val="24"/>
+                                <w:szCs w:val="24"/>
+                              </w:rPr>
+                            </w:pPr>
+                            <w:r>
+                              <w:rPr>
+                                <w:rFonts w:cstheme="minorHAnsi"/>
+                                <w:b/>
+                                <w:bCs/>
+                                <w:sz w:val="44"/>
+                                <w:szCs w:val="44"/>
+                              </w:rPr>
+                              <w:sym w:font="Symbol" w:char="F043"/>
+                            </w:r>
+                          </w:p>
+                        </w:txbxContent>
+                      </wps:txbx>
+                      <wps:bodyPr rot="0" vert="horz" wrap="square" lIns="91440" tIns="45720" rIns="91440" bIns="45720" anchor="ctr" anchorCtr="0">
+                        <a:noAutofit/>
+                      </wps:bodyPr>
+                    </wps:wsp>
+                  </a:graphicData>
+                </a:graphic>
+                <wp14:sizeRelH relativeFrom="margin">
+                  <wp14:pctWidth>0</wp14:pctWidth>
+                </wp14:sizeRelH>
+                <wp14:sizeRelV relativeFrom="margin">
+                  <wp14:pctHeight>0</wp14:pctHeight>
+                </wp14:sizeRelV>
+              </wp:anchor>
+            </w:drawing>
+          </mc:Choice>
+          <mc:Fallback>
+            <w:pict>
+              <v:shape w14:anchorId="18848D1E" id="_x0000_s1027" type="#_x0000_t202" style="position:absolute;margin-left:359.95pt;margin-top:32.95pt;width:30.35pt;height:32.25pt;z-index:251666432;visibility:visible;mso-wrap-style:square;mso-width-percent:0;mso-height-percent:0;mso-wrap-distance-left:9pt;mso-wrap-distance-top:3.6pt;mso-wrap-distance-right:9pt;mso-wrap-distance-bottom:3.6pt;mso-position-horizontal:absolute;mso-position-horizontal-relative:page;mso-position-vertical:absolute;mso-position-vertical-relative:top-margin-area;mso-width-percent:0;mso-height-percent:0;mso-width-relative:margin;mso-height-relative:margin;v-text-anchor:middle" o:gfxdata="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">
+                <v:shadow on="t" color="black" origin="-.5,-.5" offset=".52433mm,.47211mm"/>
+                <v:textbox>
+                  <w:txbxContent>
+                    <w:p>
+                      <w:pPr>
+                        <w:rPr>
+                          <w:b/>
+                          <w:bCs/>
+                          <w:sz w:val="24"/>
+                          <w:szCs w:val="24"/>
+                        </w:rPr>
+                      </w:pPr>
+                      <w:r>
+                        <w:rPr>
+                          <w:rFonts w:cstheme="minorHAnsi"/>
+                          <w:b/>
+                          <w:bCs/>
+                          <w:sz w:val="44"/>
+                          <w:szCs w:val="44"/>
+                        </w:rPr>
+                        <w:sym w:font="Symbol" w:char="F043"/>
+                      </w:r>
+                    </w:p>
+                  </w:txbxContent>
+                </v:textbox>
+                <w10:wrap type="square" anchorx="page" anchory="margin"/>
+              </v:shape>
+            </w:pict>
+          </mc:Fallback>
+        </mc:AlternateContent>
+      </w:r>
+      <w:r>
+        <w:rPr>
+          <w:noProof/>
+        </w:rPr>
+        <mc:AlternateContent>
+          <mc:Choice Requires="wps">
+            <w:drawing>
+              <wp:anchor distT="0" distB="0" distL="114300" distR="114300" simplePos="0" relativeHeight="251663360" behindDoc="0" locked="0" layoutInCell="1" allowOverlap="1" wp14:anchorId="53F1C447" wp14:editId="49565701">
+                <wp:simplePos x="0" y="0"/>
+                <wp:positionH relativeFrom="column">
+                  <wp:posOffset>3483721</wp:posOffset>
+                </wp:positionH>
+                <wp:positionV relativeFrom="page">
+                  <wp:posOffset>317500</wp:posOffset>
+                </wp:positionV>
+                <wp:extent cx="2615565" cy="1449705"/>
+                <wp:effectExtent l="0" t="0" r="0" b="0"/>
+                <wp:wrapTopAndBottom/>
+                <wp:docPr id="222840897" name="Cuadro de texto 5"/>
+                <wp:cNvGraphicFramePr/>
+                <a:graphic xmlns:a="http://schemas.openxmlformats.org/drawingml/2006/main">
+                  <a:graphicData uri="http://schemas.microsoft.com/office/word/2010/wordprocessingShape">
+                    <wps:wsp>
+                      <wps:cNvSpPr txBox="1"/>
+                      <wps:spPr>
+                        <a:xfrm>
+                          <a:off x="0" y="0"/>
+                          <a:ext cx="2615565" cy="1449705"/>
+                        </a:xfrm>
+                        <a:custGeom>
+                          <a:avLst/>
+                          <a:gdLst>
+                            <a:gd name="connsiteX0" fmla="*/ 0 w 2684145"/>
+                            <a:gd name="connsiteY0" fmla="*/ 0 h 1496060"/>
+                            <a:gd name="connsiteX1" fmla="*/ 2684145 w 2684145"/>
+                            <a:gd name="connsiteY1" fmla="*/ 0 h 1496060"/>
+                            <a:gd name="connsiteX2" fmla="*/ 2684145 w 2684145"/>
+                            <a:gd name="connsiteY2" fmla="*/ 1496060 h 1496060"/>
+                            <a:gd name="connsiteX3" fmla="*/ 0 w 2684145"/>
+                            <a:gd name="connsiteY3" fmla="*/ 1496060 h 1496060"/>
+                            <a:gd name="connsiteX4" fmla="*/ 0 w 2684145"/>
+                            <a:gd name="connsiteY4" fmla="*/ 0 h 1496060"/>
+                            <a:gd name="connsiteX0" fmla="*/ 0 w 2684145"/>
+                            <a:gd name="connsiteY0" fmla="*/ 0 h 1496060"/>
+                            <a:gd name="connsiteX1" fmla="*/ 2684145 w 2684145"/>
+                            <a:gd name="connsiteY1" fmla="*/ 0 h 1496060"/>
+                            <a:gd name="connsiteX2" fmla="*/ 2618308 w 2684145"/>
+                            <a:gd name="connsiteY2" fmla="*/ 1459484 h 1496060"/>
+                            <a:gd name="connsiteX3" fmla="*/ 0 w 2684145"/>
+                            <a:gd name="connsiteY3" fmla="*/ 1496060 h 1496060"/>
+                            <a:gd name="connsiteX4" fmla="*/ 0 w 2684145"/>
+                            <a:gd name="connsiteY4" fmla="*/ 0 h 1496060"/>
+                            <a:gd name="connsiteX0" fmla="*/ 0 w 2640254"/>
+                            <a:gd name="connsiteY0" fmla="*/ 0 h 1496060"/>
+                            <a:gd name="connsiteX1" fmla="*/ 2640254 w 2640254"/>
+                            <a:gd name="connsiteY1" fmla="*/ 95098 h 1496060"/>
+                            <a:gd name="connsiteX2" fmla="*/ 2618308 w 2640254"/>
+                            <a:gd name="connsiteY2" fmla="*/ 1459484 h 1496060"/>
+                            <a:gd name="connsiteX3" fmla="*/ 0 w 2640254"/>
+                            <a:gd name="connsiteY3" fmla="*/ 1496060 h 1496060"/>
+                            <a:gd name="connsiteX4" fmla="*/ 0 w 2640254"/>
+                            <a:gd name="connsiteY4" fmla="*/ 0 h 1496060"/>
+                            <a:gd name="connsiteX0" fmla="*/ 0 w 2640254"/>
+                            <a:gd name="connsiteY0" fmla="*/ 0 h 1496060"/>
+                            <a:gd name="connsiteX1" fmla="*/ 2640254 w 2640254"/>
+                            <a:gd name="connsiteY1" fmla="*/ 95098 h 1496060"/>
+                            <a:gd name="connsiteX2" fmla="*/ 2594648 w 2640254"/>
+                            <a:gd name="connsiteY2" fmla="*/ 1336401 h 1496060"/>
+                            <a:gd name="connsiteX3" fmla="*/ 0 w 2640254"/>
+                            <a:gd name="connsiteY3" fmla="*/ 1496060 h 1496060"/>
+                            <a:gd name="connsiteX4" fmla="*/ 0 w 2640254"/>
+                            <a:gd name="connsiteY4" fmla="*/ 0 h 1496060"/>
+                            <a:gd name="connsiteX0" fmla="*/ 0 w 2594648"/>
+                            <a:gd name="connsiteY0" fmla="*/ 0 h 1496060"/>
+                            <a:gd name="connsiteX1" fmla="*/ 2592934 w 2594648"/>
+                            <a:gd name="connsiteY1" fmla="*/ 209975 h 1496060"/>
+                            <a:gd name="connsiteX2" fmla="*/ 2594648 w 2594648"/>
+                            <a:gd name="connsiteY2" fmla="*/ 1336401 h 1496060"/>
+                            <a:gd name="connsiteX3" fmla="*/ 0 w 2594648"/>
+                            <a:gd name="connsiteY3" fmla="*/ 1496060 h 1496060"/>
+                            <a:gd name="connsiteX4" fmla="*/ 0 w 2594648"/>
+                            <a:gd name="connsiteY4" fmla="*/ 0 h 1496060"/>
+                          </a:gdLst>
+                          <a:ahLst/>
+                          <a:cxnLst>
+                            <a:cxn ang="0">
+                              <a:pos x="connsiteX0" y="connsiteY0"/>
+                            </a:cxn>
+                            <a:cxn ang="0">
+                              <a:pos x="connsiteX1" y="connsiteY1"/>
+                            </a:cxn>
+                            <a:cxn ang="0">
+                              <a:pos x="connsiteX2" y="connsiteY2"/>
+                            </a:cxn>
+                            <a:cxn ang="0">
+                              <a:pos x="connsiteX3" y="connsiteY3"/>
+                            </a:cxn>
+                            <a:cxn ang="0">
+                              <a:pos x="connsiteX4" y="connsiteY4"/>
+                            </a:cxn>
+                          </a:cxnLst>
+                          <a:rect l="l" t="t" r="r" b="b"/>
+                          <a:pathLst>
+                            <a:path w="2594648" h="1496060">
+                              <a:moveTo>
+                                <a:pt x="0" y="0"/>
+                              </a:moveTo>
+                              <a:lnTo>
+                                <a:pt x="2592934" y="209975"/>
+                              </a:lnTo>
+                              <a:cubicBezTo>
+                                <a:pt x="2593505" y="585450"/>
+                                <a:pt x="2594077" y="960926"/>
+                                <a:pt x="2594648" y="1336401"/>
+                              </a:cubicBezTo>
+                              <a:lnTo>
+                                <a:pt x="0" y="1496060"/>
+                              </a:lnTo>
+                              <a:lnTo>
+                                <a:pt x="0" y="0"/>
+                              </a:lnTo>
+                              <a:close/>
+                            </a:path>
+                          </a:pathLst>
+                        </a:custGeom>
+                        <a:solidFill>
+                          <a:schemeClr val="lt1"/>
+                        </a:solidFill>
+                        <a:ln w="6350">
+                          <a:noFill/>
+                        </a:ln>
+                      </wps:spPr>
+                      <wps:txbx>
+                        <w:txbxContent>
+                          <w:p>
+                            <w:pPr>
+                              <w:ind w:firstLine="708"/>
+                              <w:rPr>
+                                <w:rFonts w:ascii="Aptos Display" w:hAnsi="Aptos Display"/>
+                              </w:rPr>
+                            </w:pPr>
+                            <w:r>
+                              <w:rPr>
+                                <w:rFonts w:ascii="Aptos Display" w:hAnsi="Aptos Display"/>
+                                <w:b/>
+                                <w:bCs/>
+                                <w:i/>
+                                <w:iCs/>
+                                <w:sz w:val="24"/>
+                                <w:szCs w:val="24"/>
+                              </w:rPr>
+                              <w:t>PRESUPUESTO</w:t>
+                            </w:r>
+                            <w:r>
+                              <w:rPr>
+                                <w:sz w:val="20"/>
+                                <w:szCs w:val="20"/>
+                              </w:rPr>
+                              <w:br/>
+                            </w:r>
+                            <w:r>
+                              <w:rPr>
+                                <w:sz w:val="20"/>
+                                <w:szCs w:val="20"/>
+                              </w:rPr>
+                              <w:tab/>
+                            </w:r>
+                            <w:r>
+                              <w:rPr>
+                                <w:rFonts w:ascii="Aptos Display" w:hAnsi="Aptos Display"/>
+                                <w:sz w:val="20"/>
+                                <w:szCs w:val="20"/>
+                              </w:rPr>
+                              <w:t>Documento no valido como factura</w:t>
+                            </w:r>
+                            <w:r>
+                              <w:rPr>
+                                <w:rFonts w:ascii="Aptos Display" w:hAnsi="Aptos Display"/>
+                              </w:rPr>
+                              <w:br/>
+                            </w:r>
+                          </w:p>
+                          <w:p>
+                            <w:pPr>
+                              <w:ind w:firstLine="708"/>
+                              <w:rPr>
+                                <w:rFonts w:ascii="Aptos Display" w:hAnsi="Aptos Display"/>
+                              </w:rPr>
+                            </w:pPr>
+                            <w:r>
+                              <w:rPr>
+                                <w:rFonts w:ascii="Aptos Display" w:hAnsi="Aptos Display"/>
+                                <w:b/>
+                                <w:bCs/>
+                              </w:rPr>
+                              <w:t>N°</w:t>
+                            </w:r>
+                            <w:r>
+                              <w:rPr>
+                                <w:rFonts w:ascii="Aptos Display" w:hAnsi="Aptos Display"/>
+                              </w:rPr>
+                              <w:t>:</w:t>
+                            </w:r>
+                            <w:r>
+                              <w:rPr>
+                                <w:rFonts w:ascii="Aptos Display" w:hAnsi="Aptos Display"/>
+                              </w:rPr>
+                              <w:t xml:space="preserve"> </w:t>
+                            </w:r>
+                            <w:r>
+                              <w:rPr>
+                                <w:rFonts w:ascii="Aptos Display" w:hAnsi="Aptos Display"/>
+                              </w:rPr>
+                              <w:t xml:space="preserve">000 - </w:t>
+                            </w:r>
+                            <w:proofErr w:type="gramStart"/>
+                            <w:r>
+                              <w:rPr>
+                                <w:rFonts w:ascii="Aptos Display" w:hAnsi="Aptos Display"/>
+                              </w:rPr>
+                              <w:t xml:space="preserve">{{ </w:t>
+                            </w:r>
+                            <w:proofErr w:type="spellStart"/>
+                            <w:r>
+                              <w:rPr>
+                                <w:rFonts w:ascii="Aptos Display" w:hAnsi="Aptos Display"/>
+                              </w:rPr>
+                              <w:t>p</w:t>
+                            </w:r>
+                            <w:r>
+                              <w:rPr>
+                                <w:rFonts w:ascii="Aptos Display" w:hAnsi="Aptos Display"/>
+                              </w:rPr>
+                              <w:t>id</w:t>
+                            </w:r>
+                            <w:proofErr w:type="spellEnd"/>
+                            <w:proofErr w:type="gramEnd"/>
+                            <w:r>
+                              <w:rPr>
+                                <w:rFonts w:ascii="Aptos Display" w:hAnsi="Aptos Display"/>
+                              </w:rPr>
+                              <w:t xml:space="preserve"> }}</w:t>
+                            </w:r>
+                          </w:p>
+                          <w:p>
+                            <w:pPr>
+                              <w:ind w:firstLine="708"/>
+                            </w:pPr>
+                            <w:r>
+                              <w:rPr>
+                                <w:rFonts w:ascii="Aptos Display" w:hAnsi="Aptos Display"/>
+                                <w:b/>
+                                <w:bCs/>
+                              </w:rPr>
+                              <w:t>Fecha</w:t>
+                            </w:r>
+                            <w:r>
+                              <w:rPr>
+                                <w:rFonts w:ascii="Aptos Display" w:hAnsi="Aptos Display"/>
+                                <w:b/>
+                                <w:bCs/>
+                              </w:rPr>
+                              <w:t>:</w:t>
+                            </w:r>
+                            <w:r>
+                              <w:rPr>
+                                <w:rFonts w:ascii="Aptos Display" w:hAnsi="Aptos Display"/>
+                              </w:rPr>
+                              <w:t xml:space="preserve"> </w:t>
+                            </w:r>
+                            <w:proofErr w:type="gramStart"/>
+                            <w:r>
+                              <w:rPr>
+                                <w:rFonts w:ascii="Aptos Display" w:hAnsi="Aptos Display"/>
+                              </w:rPr>
+                              <w:t>{{ d</w:t>
+                            </w:r>
+                            <w:proofErr w:type="gramEnd"/>
+                            <w:r>
+                              <w:rPr>
+                                <w:rFonts w:ascii="Aptos Display" w:hAnsi="Aptos Display"/>
+                              </w:rPr>
+                              <w:t xml:space="preserve"> }} / </w:t>
+                            </w:r>
+                            <w:proofErr w:type="gramStart"/>
+                            <w:r>
+                              <w:rPr>
+                                <w:rFonts w:ascii="Aptos Display" w:hAnsi="Aptos Display"/>
+                              </w:rPr>
+                              <w:t>{{ m</w:t>
+                            </w:r>
+                            <w:proofErr w:type="gramEnd"/>
+                            <w:r>
+                              <w:rPr>
+                                <w:rFonts w:ascii="Aptos Display" w:hAnsi="Aptos Display"/>
+                              </w:rPr>
+                              <w:t xml:space="preserve"> }} / </w:t>
+                            </w:r>
+                            <w:proofErr w:type="gramStart"/>
+                            <w:r>
+                              <w:rPr>
+                                <w:rFonts w:ascii="Aptos Display" w:hAnsi="Aptos Display"/>
+                              </w:rPr>
+                              <w:t>{{ y</w:t>
+                            </w:r>
+                            <w:proofErr w:type="gramEnd"/>
+                            <w:r>
+                              <w:rPr>
+                                <w:rFonts w:ascii="Aptos Display" w:hAnsi="Aptos Display"/>
+                              </w:rPr>
+                              <w:t xml:space="preserve"> }}</w:t>
+                            </w:r>
+                          </w:p>
+                        </w:txbxContent>
+                      </wps:txbx>
+                      <wps:bodyPr rot="0" spcFirstLastPara="0" vertOverflow="overflow" horzOverflow="overflow" vert="horz" wrap="square" lIns="91440" tIns="45720" rIns="91440" bIns="45720" numCol="1" spcCol="0" rtlCol="0" fromWordArt="0" anchor="t" anchorCtr="0" forceAA="0" compatLnSpc="1">
+                        <a:prstTxWarp prst="textNoShape">
+                          <a:avLst/>
+                        </a:prstTxWarp>
+                        <a:noAutofit/>
+                      </wps:bodyPr>
+                    </wps:wsp>
+                  </a:graphicData>
+                </a:graphic>
+                <wp14:sizeRelH relativeFrom="margin">
+                  <wp14:pctWidth>0</wp14:pctWidth>
+                </wp14:sizeRelH>
+                <wp14:sizeRelV relativeFrom="margin">
+                  <wp14:pctHeight>0</wp14:pctHeight>
+                </wp14:sizeRelV>
+              </wp:anchor>
+            </w:drawing>
+          </mc:Choice>
+          <mc:Fallback>
+            <w:pict>
+              <v:shape w14:anchorId="53F1C447" id="Cuadro de texto 5" o:spid="_x0000_s1028" style="position:absolute;margin-left:274.3pt;margin-top:25pt;width:205.95pt;height:114.15pt;z-index:251663360;visibility:visible;mso-wrap-style:square;mso-width-percent:0;mso-height-percent:0;mso-wrap-distance-left:9pt;mso-wrap-distance-top:0;mso-wrap-distance-right:9pt;mso-wrap-distance-bottom:0;mso-position-horizontal:absolute;mso-position-horizontal-relative:text;mso-position-vertical:absolute;mso-position-vertical-relative:page;mso-width-percent:0;mso-height-percent:0;mso-width-relative:margin;mso-height-relative:margin;v-text-anchor:top" coordsize="2594648,1496060" o:spt="100" o:gfxdata="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" adj="-11796480,,5400" path="m,l2592934,209975v571,375475,1143,750951,1714,1126426l,1496060,,xe" fillcolor="white [3201]" stroked="f" strokeweight=".5pt">
+                <v:stroke joinstyle="miter"/>
+                <v:formulas/>
+                <v:path arrowok="t" o:connecttype="custom" o:connectlocs="0,0;2613837,203469;2615565,1294993;0,1449705;0,0" o:connectangles="0,0,0,0,0" textboxrect="0,0,2594648,1496060"/>
+                <v:textbox>
+                  <w:txbxContent>
+                    <w:p>
+                      <w:pPr>
+                        <w:ind w:firstLine="708"/>
+                        <w:rPr>
+                          <w:rFonts w:ascii="Aptos Display" w:hAnsi="Aptos Display"/>
+                        </w:rPr>
+                      </w:pPr>
+                      <w:r>
+                        <w:rPr>
+                          <w:rFonts w:ascii="Aptos Display" w:hAnsi="Aptos Display"/>
+                          <w:b/>
+                          <w:bCs/>
+                          <w:i/>
+                          <w:iCs/>
+                          <w:sz w:val="24"/>
+                          <w:szCs w:val="24"/>
+                        </w:rPr>
+                        <w:t>PRESUPUESTO</w:t>
+                      </w:r>
+                      <w:r>
+                        <w:rPr>
+                          <w:sz w:val="20"/>
+                          <w:szCs w:val="20"/>
+                        </w:rPr>
+                        <w:br/>
+                      </w:r>
+                      <w:r>
+                        <w:rPr>
+                          <w:sz w:val="20"/>
+                          <w:szCs w:val="20"/>
+                        </w:rPr>
+                        <w:tab/>
+                      </w:r>
+                      <w:r>
+                        <w:rPr>
+                          <w:rFonts w:ascii="Aptos Display" w:hAnsi="Aptos Display"/>
+                          <w:sz w:val="20"/>
+                          <w:szCs w:val="20"/>
+                        </w:rPr>
+                        <w:t>Documento no valido como factura</w:t>
+                      </w:r>
+                      <w:r>
+                        <w:rPr>
+                          <w:rFonts w:ascii="Aptos Display" w:hAnsi="Aptos Display"/>
+                        </w:rPr>
+                        <w:br/>
+                      </w:r>
+                    </w:p>
+                    <w:p>
+                      <w:pPr>
+                        <w:ind w:firstLine="708"/>
+                        <w:rPr>
+                          <w:rFonts w:ascii="Aptos Display" w:hAnsi="Aptos Display"/>
+                        </w:rPr>
+                      </w:pPr>
+                      <w:r>
+                        <w:rPr>
+                          <w:rFonts w:ascii="Aptos Display" w:hAnsi="Aptos Display"/>
+                          <w:b/>
+                          <w:bCs/>
+                        </w:rPr>
+                        <w:t>N°</w:t>
+                      </w:r>
+                      <w:r>
+                        <w:rPr>
+                          <w:rFonts w:ascii="Aptos Display" w:hAnsi="Aptos Display"/>
+                        </w:rPr>
+                        <w:t>:</w:t>
+                      </w:r>
+                      <w:r>
+                        <w:rPr>
+                          <w:rFonts w:ascii="Aptos Display" w:hAnsi="Aptos Display"/>
+                        </w:rPr>
+                        <w:t xml:space="preserve"> </w:t>
+                      </w:r>
+                      <w:r>
+                        <w:rPr>
+                          <w:rFonts w:ascii="Aptos Display" w:hAnsi="Aptos Display"/>
+                        </w:rPr>
+                        <w:t xml:space="preserve">000 - </w:t>
+                      </w:r>
+                      <w:proofErr w:type="gramStart"/>
+                      <w:r>
+                        <w:rPr>
+                          <w:rFonts w:ascii="Aptos Display" w:hAnsi="Aptos Display"/>
+                        </w:rPr>
+                        <w:t xml:space="preserve">{{ </w:t>
+                      </w:r>
+                      <w:proofErr w:type="spellStart"/>
+                      <w:r>
+                        <w:rPr>
+                          <w:rFonts w:ascii="Aptos Display" w:hAnsi="Aptos Display"/>
+                        </w:rPr>
+                        <w:t>p</w:t>
+                      </w:r>
+                      <w:r>
+                        <w:rPr>
+                          <w:rFonts w:ascii="Aptos Display" w:hAnsi="Aptos Display"/>
+                        </w:rPr>
+                        <w:t>id</w:t>
+                      </w:r>
+                      <w:proofErr w:type="spellEnd"/>
+                      <w:proofErr w:type="gramEnd"/>
+                      <w:r>
+                        <w:rPr>
+                          <w:rFonts w:ascii="Aptos Display" w:hAnsi="Aptos Display"/>
+                        </w:rPr>
+                        <w:t xml:space="preserve"> }}</w:t>
+                      </w:r>
+                    </w:p>
+                    <w:p>
+                      <w:pPr>
+                        <w:ind w:firstLine="708"/>
+                      </w:pPr>
+                      <w:r>
+                        <w:rPr>
+                          <w:rFonts w:ascii="Aptos Display" w:hAnsi="Aptos Display"/>
+                          <w:b/>
+                          <w:bCs/>
+                        </w:rPr>
+                        <w:t>Fecha</w:t>
+                      </w:r>
+                      <w:r>
+                        <w:rPr>
+                          <w:rFonts w:ascii="Aptos Display" w:hAnsi="Aptos Display"/>
+                          <w:b/>
+                          <w:bCs/>
+                        </w:rPr>
+                        <w:t>:</w:t>
+                      </w:r>
+                      <w:r>
+                        <w:rPr>
+                          <w:rFonts w:ascii="Aptos Display" w:hAnsi="Aptos Display"/>
+                        </w:rPr>
+                        <w:t xml:space="preserve"> </w:t>
+                      </w:r>
+                      <w:proofErr w:type="gramStart"/>
+                      <w:r>
+                        <w:rPr>
+                          <w:rFonts w:ascii="Aptos Display" w:hAnsi="Aptos Display"/>
+                        </w:rPr>
+                        <w:t>{{ d</w:t>
+                      </w:r>
+                      <w:proofErr w:type="gramEnd"/>
+                      <w:r>
+                        <w:rPr>
+                          <w:rFonts w:ascii="Aptos Display" w:hAnsi="Aptos Display"/>
+                        </w:rPr>
+                        <w:t xml:space="preserve"> }} / </w:t>
+                      </w:r>
+                      <w:proofErr w:type="gramStart"/>
+                      <w:r>
+                        <w:rPr>
+                          <w:rFonts w:ascii="Aptos Display" w:hAnsi="Aptos Display"/>
+                        </w:rPr>
+                        <w:t>{{ m</w:t>
+                      </w:r>
+                      <w:proofErr w:type="gramEnd"/>
+                      <w:r>
+                        <w:rPr>
+                          <w:rFonts w:ascii="Aptos Display" w:hAnsi="Aptos Display"/>
+                        </w:rPr>
+                        <w:t xml:space="preserve"> }} / </w:t>
+                      </w:r>
+                      <w:proofErr w:type="gramStart"/>
+                      <w:r>
+                        <w:rPr>
+                          <w:rFonts w:ascii="Aptos Display" w:hAnsi="Aptos Display"/>
+                        </w:rPr>
+                        <w:t>{{ y</w:t>
+                      </w:r>
+                      <w:proofErr w:type="gramEnd"/>
+                      <w:r>
+                        <w:rPr>
+                          <w:rFonts w:ascii="Aptos Display" w:hAnsi="Aptos Display"/>
+                        </w:rPr>
+                        <w:t xml:space="preserve"> }}</w:t>
+                      </w:r>
+                    </w:p>
+                  </w:txbxContent>
+                </v:textbox>
+                <w10:wrap type="topAndBottom" anchory="page"/>
+              </v:shape>
+            </w:pict>
+          </mc:Fallback>
+        </mc:AlternateContent>
+      </w:r>
+      <w:r>
+        <w:rPr>
+          <w:noProof/>
+        </w:rPr>
+        <mc:AlternateContent>
+          <mc:Choice Requires="wps">
+            <w:drawing>
+              <wp:anchor distT="0" distB="0" distL="114300" distR="114300" simplePos="0" relativeHeight="251664384" behindDoc="0" locked="0" layoutInCell="1" allowOverlap="1" wp14:anchorId="08D985C9" wp14:editId="4D34635D">
+                <wp:simplePos x="0" y="0"/>
+                <wp:positionH relativeFrom="column">
+                  <wp:posOffset>3665496</wp:posOffset>
+                </wp:positionH>
+                <wp:positionV relativeFrom="page">
+                  <wp:posOffset>270841</wp:posOffset>
+                </wp:positionV>
+                <wp:extent cx="11430" cy="1515745"/>
+                <wp:effectExtent l="0" t="0" r="26670" b="27305"/>
+                <wp:wrapTopAndBottom/>
+                <wp:docPr id="1543018858" name="Conector recto 9"/>
+                <wp:cNvGraphicFramePr/>
+                <a:graphic xmlns:a="http://schemas.openxmlformats.org/drawingml/2006/main">
+                  <a:graphicData uri="http://schemas.microsoft.com/office/word/2010/wordprocessingShape">
+                    <wps:wsp>
+                      <wps:cNvCnPr/>
+                      <wps:spPr>
+                        <a:xfrm flipV="1">
+                          <a:off x="0" y="0"/>
+                          <a:ext cx="11430" cy="1515745"/>
+                        </a:xfrm>
+                        <a:prstGeom prst="line">
+                          <a:avLst/>
+                        </a:prstGeom>
+                      </wps:spPr>
+                      <wps:style>
+                        <a:lnRef idx="1">
+                          <a:schemeClr val="dk1"/>
+                        </a:lnRef>
+                        <a:fillRef idx="0">
+                          <a:schemeClr val="dk1"/>
+                        </a:fillRef>
+                        <a:effectRef idx="0">
+                          <a:schemeClr val="dk1"/>
+                        </a:effectRef>
+                        <a:fontRef idx="minor">
+                          <a:schemeClr val="tx1"/>
+                        </a:fontRef>
+                      </wps:style>
+                      <wps:bodyPr/>
+                    </wps:wsp>
+                  </a:graphicData>
+                </a:graphic>
+                <wp14:sizeRelH relativeFrom="margin">
+                  <wp14:pctWidth>0</wp14:pctWidth>
+                </wp14:sizeRelH>
+                <wp14:sizeRelV relativeFrom="margin">
+                  <wp14:pctHeight>0</wp14:pctHeight>
+                </wp14:sizeRelV>
+              </wp:anchor>
+            </w:drawing>
+          </mc:Choice>
+          <mc:Fallback>
+            <w:pict>
+              <v:line w14:anchorId="185BCAEB" id="Conector recto 9" o:spid="_x0000_s1026" style="position:absolute;flip:y;z-index:251664384;visibility:visible;mso-wrap-style:square;mso-width-percent:0;mso-height-percent:0;mso-wrap-distance-left:9pt;mso-wrap-distance-top:0;mso-wrap-distance-right:9pt;mso-wrap-distance-bottom:0;mso-position-horizontal:absolute;mso-position-horizontal-relative:text;mso-position-vertical:absolute;mso-position-vertical-relative:page;mso-width-percent:0;mso-height-percent:0;mso-width-relative:margin;mso-height-relative:margin" from="288.6pt,21.35pt" to="289.5pt,140.7pt" o:gfxdata="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" strokecolor="black [3200]" strokeweight=".5pt">
+                <v:stroke joinstyle="miter"/>
+                <w10:wrap type="topAndBottom" anchory="page"/>
+              </v:line>
+            </w:pict>
+          </mc:Fallback>
+        </mc:AlternateContent>
+      </w:r>
       <w:r>
         <w:rPr>
           <w:noProof/>
@@ -825,7 +1889,7 @@
           </mc:Choice>
           <mc:Fallback>
             <w:pict>
-              <v:roundrect w14:anchorId="2A632006" id="Cuadro de texto 2" o:spid="_x0000_s1026" style="position:absolute;margin-left:-58.9pt;margin-top:74.5pt;width:540.75pt;height:103.5pt;z-index:251668480;visibility:visible;mso-wrap-style:square;mso-width-percent:0;mso-height-percent:0;mso-wrap-distance-left:9pt;mso-wrap-distance-top:3.6pt;mso-wrap-distance-right:9pt;mso-wrap-distance-bottom:3.6pt;mso-position-horizontal:absolute;mso-position-horizontal-relative:margin;mso-position-vertical:absolute;mso-position-vertical-relative:text;mso-width-percent:0;mso-height-percent:0;mso-width-relative:margin;mso-height-relative:margin;v-text-anchor:top" arcsize="10923f" o:gfxdata="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">
+              <v:roundrect w14:anchorId="2A632006" id="_x0000_s1029" style="position:absolute;margin-left:-58.9pt;margin-top:74.5pt;width:540.75pt;height:103.5pt;z-index:251668480;visibility:visible;mso-wrap-style:square;mso-width-percent:0;mso-height-percent:0;mso-wrap-distance-left:9pt;mso-wrap-distance-top:3.6pt;mso-wrap-distance-right:9pt;mso-wrap-distance-bottom:3.6pt;mso-position-horizontal:absolute;mso-position-horizontal-relative:margin;mso-position-vertical:absolute;mso-position-vertical-relative:text;mso-width-percent:0;mso-height-percent:0;mso-width-relative:margin;mso-height-relative:margin;v-text-anchor:top" arcsize="10923f" o:gfxdata="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">
                 <v:stroke joinstyle="miter"/>
                 <v:textbox>
                   <w:txbxContent>
@@ -1267,7 +2331,7 @@
         <mc:AlternateContent>
           <mc:Choice Requires="wps">
             <w:drawing>
-              <wp:anchor distT="45720" distB="45720" distL="114300" distR="114300" simplePos="0" relativeHeight="251670528" behindDoc="0" locked="0" layoutInCell="1" allowOverlap="1" wp14:anchorId="35AE86FC" wp14:editId="25808C94">
+              <wp:anchor distT="45720" distB="45720" distL="114300" distR="114300" simplePos="0" relativeHeight="251670528" behindDoc="0" locked="0" layoutInCell="1" allowOverlap="1" wp14:anchorId="35AE86FC" wp14:editId="517CB41C">
                 <wp:simplePos x="0" y="0"/>
                 <wp:positionH relativeFrom="margin">
                   <wp:align>center</wp:align>
@@ -2398,11 +3462,7 @@
           </mc:Choice>
           <mc:Fallback>
             <w:pict>
-              <v:shapetype w14:anchorId="35AE86FC" id="_x0000_t202" coordsize="21600,21600" o:spt="202" path="m,l,21600r21600,l21600,xe">
-                <v:stroke joinstyle="miter"/>
-                <v:path gradientshapeok="t" o:connecttype="rect"/>
-              </v:shapetype>
-              <v:shape id="_x0000_s1027" type="#_x0000_t202" style="position:absolute;margin-left:0;margin-top:182.55pt;width:540.85pt;height:361.15pt;z-index:251670528;visibility:visible;mso-wrap-style:square;mso-width-percent:0;mso-height-percent:0;mso-wrap-distance-left:9pt;mso-wrap-distance-top:3.6pt;mso-wrap-distance-right:9pt;mso-wrap-distance-bottom:3.6pt;mso-position-horizontal:center;mso-position-horizontal-relative:margin;mso-position-vertical:absolute;mso-position-vertical-relative:text;mso-width-percent:0;mso-height-percent:0;mso-width-relative:margin;mso-height-relative:margin;v-text-anchor:top" o:gfxdata="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" filled="f" stroked="f">
+              <v:shape w14:anchorId="35AE86FC" id="_x0000_s1030" type="#_x0000_t202" style="position:absolute;margin-left:0;margin-top:182.55pt;width:540.85pt;height:361.15pt;z-index:251670528;visibility:visible;mso-wrap-style:square;mso-width-percent:0;mso-height-percent:0;mso-wrap-distance-left:9pt;mso-wrap-distance-top:3.6pt;mso-wrap-distance-right:9pt;mso-wrap-distance-bottom:3.6pt;mso-position-horizontal:center;mso-position-horizontal-relative:margin;mso-position-vertical:absolute;mso-position-vertical-relative:text;mso-width-percent:0;mso-height-percent:0;mso-width-relative:margin;mso-height-relative:margin;v-text-anchor:top" o:gfxdata="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" filled="f" stroked="f">
                 <v:textbox>
                   <w:txbxContent>
                     <w:tbl>
@@ -3470,930 +4530,6 @@
                   </w:txbxContent>
                 </v:textbox>
                 <w10:wrap type="topAndBottom" anchorx="margin"/>
-              </v:shape>
-            </w:pict>
-          </mc:Fallback>
-        </mc:AlternateContent>
-      </w:r>
-      <w:r>
-        <w:rPr>
-          <w:noProof/>
-        </w:rPr>
-        <mc:AlternateContent>
-          <mc:Choice Requires="wps">
-            <w:drawing>
-              <wp:anchor distT="45720" distB="45720" distL="114300" distR="114300" simplePos="0" relativeHeight="251666432" behindDoc="0" locked="0" layoutInCell="1" allowOverlap="1" wp14:anchorId="18848D1E" wp14:editId="4D1B29D6">
-                <wp:simplePos x="0" y="0"/>
-                <wp:positionH relativeFrom="page">
-                  <wp:posOffset>4405325</wp:posOffset>
-                </wp:positionH>
-                <wp:positionV relativeFrom="topMargin">
-                  <wp:align>bottom</wp:align>
-                </wp:positionV>
-                <wp:extent cx="385445" cy="409575"/>
-                <wp:effectExtent l="0" t="0" r="33655" b="47625"/>
-                <wp:wrapSquare wrapText="bothSides"/>
-                <wp:docPr id="1517717947" name="Cuadro de texto 2"/>
-                <wp:cNvGraphicFramePr>
-                  <a:graphicFrameLocks xmlns:a="http://schemas.openxmlformats.org/drawingml/2006/main"/>
-                </wp:cNvGraphicFramePr>
-                <a:graphic xmlns:a="http://schemas.openxmlformats.org/drawingml/2006/main">
-                  <a:graphicData uri="http://schemas.microsoft.com/office/word/2010/wordprocessingShape">
-                    <wps:wsp>
-                      <wps:cNvSpPr txBox="1">
-                        <a:spLocks noChangeArrowheads="1"/>
-                      </wps:cNvSpPr>
-                      <wps:spPr bwMode="auto">
-                        <a:xfrm>
-                          <a:off x="0" y="0"/>
-                          <a:ext cx="385445" cy="409575"/>
-                        </a:xfrm>
-                        <a:prstGeom prst="rect">
-                          <a:avLst/>
-                        </a:prstGeom>
-                        <a:solidFill>
-                          <a:srgbClr val="FFFFFF"/>
-                        </a:solidFill>
-                        <a:ln w="9525">
-                          <a:solidFill>
-                            <a:srgbClr val="000000"/>
-                          </a:solidFill>
-                          <a:miter lim="800000"/>
-                          <a:headEnd/>
-                          <a:tailEnd/>
-                        </a:ln>
-                        <a:effectLst>
-                          <a:outerShdw dist="25400" dir="2520000" algn="tl" rotWithShape="0">
-                            <a:prstClr val="black"/>
-                          </a:outerShdw>
-                        </a:effectLst>
-                      </wps:spPr>
-                      <wps:txbx>
-                        <w:txbxContent>
-                          <w:p>
-                            <w:pPr>
-                              <w:rPr>
-                                <w:b/>
-                                <w:bCs/>
-                                <w:sz w:val="24"/>
-                                <w:szCs w:val="24"/>
-                              </w:rPr>
-                            </w:pPr>
-                            <w:r>
-                              <w:rPr>
-                                <w:rFonts w:cstheme="minorHAnsi"/>
-                                <w:b/>
-                                <w:bCs/>
-                                <w:sz w:val="44"/>
-                                <w:szCs w:val="44"/>
-                              </w:rPr>
-                              <w:sym w:font="Symbol" w:char="F043"/>
-                            </w:r>
-                          </w:p>
-                        </w:txbxContent>
-                      </wps:txbx>
-                      <wps:bodyPr rot="0" vert="horz" wrap="square" lIns="91440" tIns="45720" rIns="91440" bIns="45720" anchor="ctr" anchorCtr="0">
-                        <a:noAutofit/>
-                      </wps:bodyPr>
-                    </wps:wsp>
-                  </a:graphicData>
-                </a:graphic>
-                <wp14:sizeRelH relativeFrom="margin">
-                  <wp14:pctWidth>0</wp14:pctWidth>
-                </wp14:sizeRelH>
-                <wp14:sizeRelV relativeFrom="margin">
-                  <wp14:pctHeight>0</wp14:pctHeight>
-                </wp14:sizeRelV>
-              </wp:anchor>
-            </w:drawing>
-          </mc:Choice>
-          <mc:Fallback>
-            <w:pict>
-              <v:shape w14:anchorId="18848D1E" id="_x0000_s1028" type="#_x0000_t202" style="position:absolute;margin-left:346.9pt;margin-top:0;width:30.35pt;height:32.25pt;z-index:251666432;visibility:visible;mso-wrap-style:square;mso-width-percent:0;mso-height-percent:0;mso-wrap-distance-left:9pt;mso-wrap-distance-top:3.6pt;mso-wrap-distance-right:9pt;mso-wrap-distance-bottom:3.6pt;mso-position-horizontal:absolute;mso-position-horizontal-relative:page;mso-position-vertical:bottom;mso-position-vertical-relative:top-margin-area;mso-width-percent:0;mso-height-percent:0;mso-width-relative:margin;mso-height-relative:margin;v-text-anchor:middle" o:gfxdata="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">
-                <v:shadow on="t" color="black" origin="-.5,-.5" offset=".52433mm,.47211mm"/>
-                <v:textbox>
-                  <w:txbxContent>
-                    <w:p>
-                      <w:pPr>
-                        <w:rPr>
-                          <w:b/>
-                          <w:bCs/>
-                          <w:sz w:val="24"/>
-                          <w:szCs w:val="24"/>
-                        </w:rPr>
-                      </w:pPr>
-                      <w:r>
-                        <w:rPr>
-                          <w:rFonts w:cstheme="minorHAnsi"/>
-                          <w:b/>
-                          <w:bCs/>
-                          <w:sz w:val="44"/>
-                          <w:szCs w:val="44"/>
-                        </w:rPr>
-                        <w:sym w:font="Symbol" w:char="F043"/>
-                      </w:r>
-                    </w:p>
-                  </w:txbxContent>
-                </v:textbox>
-                <w10:wrap type="square" anchorx="page" anchory="margin"/>
-              </v:shape>
-            </w:pict>
-          </mc:Fallback>
-        </mc:AlternateContent>
-      </w:r>
-      <w:r>
-        <w:rPr>
-          <w:noProof/>
-        </w:rPr>
-        <mc:AlternateContent>
-          <mc:Choice Requires="wps">
-            <w:drawing>
-              <wp:anchor distT="0" distB="0" distL="114300" distR="114300" simplePos="0" relativeHeight="251663360" behindDoc="0" locked="0" layoutInCell="1" allowOverlap="1" wp14:anchorId="53F1C447" wp14:editId="30C2F5D4">
-                <wp:simplePos x="0" y="0"/>
-                <wp:positionH relativeFrom="column">
-                  <wp:posOffset>3352165</wp:posOffset>
-                </wp:positionH>
-                <wp:positionV relativeFrom="page">
-                  <wp:posOffset>327888</wp:posOffset>
-                </wp:positionV>
-                <wp:extent cx="2661920" cy="1449705"/>
-                <wp:effectExtent l="0" t="0" r="5080" b="0"/>
-                <wp:wrapTopAndBottom/>
-                <wp:docPr id="222840897" name="Cuadro de texto 5"/>
-                <wp:cNvGraphicFramePr/>
-                <a:graphic xmlns:a="http://schemas.openxmlformats.org/drawingml/2006/main">
-                  <a:graphicData uri="http://schemas.microsoft.com/office/word/2010/wordprocessingShape">
-                    <wps:wsp>
-                      <wps:cNvSpPr txBox="1"/>
-                      <wps:spPr>
-                        <a:xfrm>
-                          <a:off x="0" y="0"/>
-                          <a:ext cx="2661920" cy="1449705"/>
-                        </a:xfrm>
-                        <a:custGeom>
-                          <a:avLst/>
-                          <a:gdLst>
-                            <a:gd name="connsiteX0" fmla="*/ 0 w 2684145"/>
-                            <a:gd name="connsiteY0" fmla="*/ 0 h 1496060"/>
-                            <a:gd name="connsiteX1" fmla="*/ 2684145 w 2684145"/>
-                            <a:gd name="connsiteY1" fmla="*/ 0 h 1496060"/>
-                            <a:gd name="connsiteX2" fmla="*/ 2684145 w 2684145"/>
-                            <a:gd name="connsiteY2" fmla="*/ 1496060 h 1496060"/>
-                            <a:gd name="connsiteX3" fmla="*/ 0 w 2684145"/>
-                            <a:gd name="connsiteY3" fmla="*/ 1496060 h 1496060"/>
-                            <a:gd name="connsiteX4" fmla="*/ 0 w 2684145"/>
-                            <a:gd name="connsiteY4" fmla="*/ 0 h 1496060"/>
-                            <a:gd name="connsiteX0" fmla="*/ 0 w 2684145"/>
-                            <a:gd name="connsiteY0" fmla="*/ 0 h 1496060"/>
-                            <a:gd name="connsiteX1" fmla="*/ 2684145 w 2684145"/>
-                            <a:gd name="connsiteY1" fmla="*/ 0 h 1496060"/>
-                            <a:gd name="connsiteX2" fmla="*/ 2618308 w 2684145"/>
-                            <a:gd name="connsiteY2" fmla="*/ 1459484 h 1496060"/>
-                            <a:gd name="connsiteX3" fmla="*/ 0 w 2684145"/>
-                            <a:gd name="connsiteY3" fmla="*/ 1496060 h 1496060"/>
-                            <a:gd name="connsiteX4" fmla="*/ 0 w 2684145"/>
-                            <a:gd name="connsiteY4" fmla="*/ 0 h 1496060"/>
-                            <a:gd name="connsiteX0" fmla="*/ 0 w 2640254"/>
-                            <a:gd name="connsiteY0" fmla="*/ 0 h 1496060"/>
-                            <a:gd name="connsiteX1" fmla="*/ 2640254 w 2640254"/>
-                            <a:gd name="connsiteY1" fmla="*/ 95098 h 1496060"/>
-                            <a:gd name="connsiteX2" fmla="*/ 2618308 w 2640254"/>
-                            <a:gd name="connsiteY2" fmla="*/ 1459484 h 1496060"/>
-                            <a:gd name="connsiteX3" fmla="*/ 0 w 2640254"/>
-                            <a:gd name="connsiteY3" fmla="*/ 1496060 h 1496060"/>
-                            <a:gd name="connsiteX4" fmla="*/ 0 w 2640254"/>
-                            <a:gd name="connsiteY4" fmla="*/ 0 h 1496060"/>
-                          </a:gdLst>
-                          <a:ahLst/>
-                          <a:cxnLst>
-                            <a:cxn ang="0">
-                              <a:pos x="connsiteX0" y="connsiteY0"/>
-                            </a:cxn>
-                            <a:cxn ang="0">
-                              <a:pos x="connsiteX1" y="connsiteY1"/>
-                            </a:cxn>
-                            <a:cxn ang="0">
-                              <a:pos x="connsiteX2" y="connsiteY2"/>
-                            </a:cxn>
-                            <a:cxn ang="0">
-                              <a:pos x="connsiteX3" y="connsiteY3"/>
-                            </a:cxn>
-                            <a:cxn ang="0">
-                              <a:pos x="connsiteX4" y="connsiteY4"/>
-                            </a:cxn>
-                          </a:cxnLst>
-                          <a:rect l="l" t="t" r="r" b="b"/>
-                          <a:pathLst>
-                            <a:path w="2640254" h="1496060">
-                              <a:moveTo>
-                                <a:pt x="0" y="0"/>
-                              </a:moveTo>
-                              <a:lnTo>
-                                <a:pt x="2640254" y="95098"/>
-                              </a:lnTo>
-                              <a:lnTo>
-                                <a:pt x="2618308" y="1459484"/>
-                              </a:lnTo>
-                              <a:lnTo>
-                                <a:pt x="0" y="1496060"/>
-                              </a:lnTo>
-                              <a:lnTo>
-                                <a:pt x="0" y="0"/>
-                              </a:lnTo>
-                              <a:close/>
-                            </a:path>
-                          </a:pathLst>
-                        </a:custGeom>
-                        <a:solidFill>
-                          <a:schemeClr val="lt1"/>
-                        </a:solidFill>
-                        <a:ln w="6350">
-                          <a:noFill/>
-                        </a:ln>
-                      </wps:spPr>
-                      <wps:txbx>
-                        <w:txbxContent>
-                          <w:p>
-                            <w:pPr>
-                              <w:ind w:firstLine="708"/>
-                              <w:rPr>
-                                <w:rFonts w:ascii="Aptos Display" w:hAnsi="Aptos Display"/>
-                              </w:rPr>
-                            </w:pPr>
-                            <w:r>
-                              <w:rPr>
-                                <w:rFonts w:ascii="Aptos Display" w:hAnsi="Aptos Display"/>
-                                <w:b/>
-                                <w:bCs/>
-                                <w:i/>
-                                <w:iCs/>
-                                <w:sz w:val="28"/>
-                                <w:szCs w:val="28"/>
-                              </w:rPr>
-                              <w:t>PRESUPUESTO</w:t>
-                            </w:r>
-                            <w:r>
-                              <w:br/>
-                            </w:r>
-                            <w:r>
-                              <w:tab/>
-                            </w:r>
-                            <w:r>
-                              <w:rPr>
-                                <w:rFonts w:ascii="Aptos Display" w:hAnsi="Aptos Display"/>
-                              </w:rPr>
-                              <w:t>Documento no valido como factura</w:t>
-                            </w:r>
-                            <w:r>
-                              <w:rPr>
-                                <w:rFonts w:ascii="Aptos Display" w:hAnsi="Aptos Display"/>
-                              </w:rPr>
-                              <w:br/>
-                            </w:r>
-                          </w:p>
-                          <w:p>
-                            <w:pPr>
-                              <w:ind w:firstLine="708"/>
-                              <w:rPr>
-                                <w:rFonts w:ascii="Aptos Display" w:hAnsi="Aptos Display"/>
-                              </w:rPr>
-                            </w:pPr>
-                            <w:r>
-                              <w:rPr>
-                                <w:rFonts w:ascii="Aptos Display" w:hAnsi="Aptos Display"/>
-                                <w:b/>
-                                <w:bCs/>
-                              </w:rPr>
-                              <w:t>N°</w:t>
-                            </w:r>
-                            <w:r>
-                              <w:rPr>
-                                <w:rFonts w:ascii="Aptos Display" w:hAnsi="Aptos Display"/>
-                              </w:rPr>
-                              <w:t>:</w:t>
-                            </w:r>
-                            <w:r>
-                              <w:rPr>
-                                <w:rFonts w:ascii="Aptos Display" w:hAnsi="Aptos Display"/>
-                              </w:rPr>
-                              <w:t xml:space="preserve"> </w:t>
-                            </w:r>
-                            <w:r>
-                              <w:rPr>
-                                <w:rFonts w:ascii="Aptos Display" w:hAnsi="Aptos Display"/>
-                              </w:rPr>
-                              <w:t xml:space="preserve">000 - </w:t>
-                            </w:r>
-                            <w:proofErr w:type="gramStart"/>
-                            <w:r>
-                              <w:rPr>
-                                <w:rFonts w:ascii="Aptos Display" w:hAnsi="Aptos Display"/>
-                              </w:rPr>
-                              <w:t xml:space="preserve">{{ </w:t>
-                            </w:r>
-                            <w:proofErr w:type="spellStart"/>
-                            <w:r>
-                              <w:rPr>
-                                <w:rFonts w:ascii="Aptos Display" w:hAnsi="Aptos Display"/>
-                              </w:rPr>
-                              <w:t>p</w:t>
-                            </w:r>
-                            <w:r>
-                              <w:rPr>
-                                <w:rFonts w:ascii="Aptos Display" w:hAnsi="Aptos Display"/>
-                              </w:rPr>
-                              <w:t>id</w:t>
-                            </w:r>
-                            <w:proofErr w:type="spellEnd"/>
-                            <w:proofErr w:type="gramEnd"/>
-                            <w:r>
-                              <w:rPr>
-                                <w:rFonts w:ascii="Aptos Display" w:hAnsi="Aptos Display"/>
-                              </w:rPr>
-                              <w:t xml:space="preserve"> }}</w:t>
-                            </w:r>
-                          </w:p>
-                          <w:p>
-                            <w:pPr>
-                              <w:ind w:firstLine="708"/>
-                            </w:pPr>
-                            <w:r>
-                              <w:rPr>
-                                <w:rFonts w:ascii="Aptos Display" w:hAnsi="Aptos Display"/>
-                                <w:b/>
-                                <w:bCs/>
-                              </w:rPr>
-                              <w:t>Fecha</w:t>
-                            </w:r>
-                            <w:r>
-                              <w:rPr>
-                                <w:rFonts w:ascii="Aptos Display" w:hAnsi="Aptos Display"/>
-                                <w:b/>
-                                <w:bCs/>
-                              </w:rPr>
-                              <w:t>:</w:t>
-                            </w:r>
-                            <w:r>
-                              <w:rPr>
-                                <w:rFonts w:ascii="Aptos Display" w:hAnsi="Aptos Display"/>
-                              </w:rPr>
-                              <w:t xml:space="preserve"> </w:t>
-                            </w:r>
-                            <w:proofErr w:type="gramStart"/>
-                            <w:r>
-                              <w:rPr>
-                                <w:rFonts w:ascii="Aptos Display" w:hAnsi="Aptos Display"/>
-                              </w:rPr>
-                              <w:t>{{ d</w:t>
-                            </w:r>
-                            <w:proofErr w:type="gramEnd"/>
-                            <w:r>
-                              <w:rPr>
-                                <w:rFonts w:ascii="Aptos Display" w:hAnsi="Aptos Display"/>
-                              </w:rPr>
-                              <w:t xml:space="preserve"> }} / </w:t>
-                            </w:r>
-                            <w:proofErr w:type="gramStart"/>
-                            <w:r>
-                              <w:rPr>
-                                <w:rFonts w:ascii="Aptos Display" w:hAnsi="Aptos Display"/>
-                              </w:rPr>
-                              <w:t>{{ m</w:t>
-                            </w:r>
-                            <w:proofErr w:type="gramEnd"/>
-                            <w:r>
-                              <w:rPr>
-                                <w:rFonts w:ascii="Aptos Display" w:hAnsi="Aptos Display"/>
-                              </w:rPr>
-                              <w:t xml:space="preserve"> }} / </w:t>
-                            </w:r>
-                            <w:proofErr w:type="gramStart"/>
-                            <w:r>
-                              <w:rPr>
-                                <w:rFonts w:ascii="Aptos Display" w:hAnsi="Aptos Display"/>
-                              </w:rPr>
-                              <w:t>{{ y</w:t>
-                            </w:r>
-                            <w:proofErr w:type="gramEnd"/>
-                            <w:r>
-                              <w:rPr>
-                                <w:rFonts w:ascii="Aptos Display" w:hAnsi="Aptos Display"/>
-                              </w:rPr>
-                              <w:t xml:space="preserve"> }}</w:t>
-                            </w:r>
-                          </w:p>
-                        </w:txbxContent>
-                      </wps:txbx>
-                      <wps:bodyPr rot="0" spcFirstLastPara="0" vertOverflow="overflow" horzOverflow="overflow" vert="horz" wrap="square" lIns="91440" tIns="45720" rIns="91440" bIns="45720" numCol="1" spcCol="0" rtlCol="0" fromWordArt="0" anchor="t" anchorCtr="0" forceAA="0" compatLnSpc="1">
-                        <a:prstTxWarp prst="textNoShape">
-                          <a:avLst/>
-                        </a:prstTxWarp>
-                        <a:noAutofit/>
-                      </wps:bodyPr>
-                    </wps:wsp>
-                  </a:graphicData>
-                </a:graphic>
-                <wp14:sizeRelH relativeFrom="margin">
-                  <wp14:pctWidth>0</wp14:pctWidth>
-                </wp14:sizeRelH>
-                <wp14:sizeRelV relativeFrom="margin">
-                  <wp14:pctHeight>0</wp14:pctHeight>
-                </wp14:sizeRelV>
-              </wp:anchor>
-            </w:drawing>
-          </mc:Choice>
-          <mc:Fallback>
-            <w:pict>
-              <v:shape w14:anchorId="53F1C447" id="Cuadro de texto 5" o:spid="_x0000_s1029" style="position:absolute;margin-left:263.95pt;margin-top:25.8pt;width:209.6pt;height:114.15pt;z-index:251663360;visibility:visible;mso-wrap-style:square;mso-width-percent:0;mso-height-percent:0;mso-wrap-distance-left:9pt;mso-wrap-distance-top:0;mso-wrap-distance-right:9pt;mso-wrap-distance-bottom:0;mso-position-horizontal:absolute;mso-position-horizontal-relative:text;mso-position-vertical:absolute;mso-position-vertical-relative:page;mso-width-percent:0;mso-height-percent:0;mso-width-relative:margin;mso-height-relative:margin;v-text-anchor:top" coordsize="2640254,1496060" o:spt="100" o:gfxdata="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" adj="-11796480,,5400" path="m,l2640254,95098r-21946,1364386l,1496060,,xe" fillcolor="white [3201]" stroked="f" strokeweight=".5pt">
-                <v:stroke joinstyle="miter"/>
-                <v:formulas/>
-                <v:path arrowok="t" o:connecttype="custom" o:connectlocs="0,0;2661920,92151;2639794,1414262;0,1449705;0,0" o:connectangles="0,0,0,0,0" textboxrect="0,0,2640254,1496060"/>
-                <v:textbox>
-                  <w:txbxContent>
-                    <w:p>
-                      <w:pPr>
-                        <w:ind w:firstLine="708"/>
-                        <w:rPr>
-                          <w:rFonts w:ascii="Aptos Display" w:hAnsi="Aptos Display"/>
-                        </w:rPr>
-                      </w:pPr>
-                      <w:r>
-                        <w:rPr>
-                          <w:rFonts w:ascii="Aptos Display" w:hAnsi="Aptos Display"/>
-                          <w:b/>
-                          <w:bCs/>
-                          <w:i/>
-                          <w:iCs/>
-                          <w:sz w:val="28"/>
-                          <w:szCs w:val="28"/>
-                        </w:rPr>
-                        <w:t>PRESUPUESTO</w:t>
-                      </w:r>
-                      <w:r>
-                        <w:br/>
-                      </w:r>
-                      <w:r>
-                        <w:tab/>
-                      </w:r>
-                      <w:r>
-                        <w:rPr>
-                          <w:rFonts w:ascii="Aptos Display" w:hAnsi="Aptos Display"/>
-                        </w:rPr>
-                        <w:t>Documento no valido como factura</w:t>
-                      </w:r>
-                      <w:r>
-                        <w:rPr>
-                          <w:rFonts w:ascii="Aptos Display" w:hAnsi="Aptos Display"/>
-                        </w:rPr>
-                        <w:br/>
-                      </w:r>
-                    </w:p>
-                    <w:p>
-                      <w:pPr>
-                        <w:ind w:firstLine="708"/>
-                        <w:rPr>
-                          <w:rFonts w:ascii="Aptos Display" w:hAnsi="Aptos Display"/>
-                        </w:rPr>
-                      </w:pPr>
-                      <w:r>
-                        <w:rPr>
-                          <w:rFonts w:ascii="Aptos Display" w:hAnsi="Aptos Display"/>
-                          <w:b/>
-                          <w:bCs/>
-                        </w:rPr>
-                        <w:t>N°</w:t>
-                      </w:r>
-                      <w:r>
-                        <w:rPr>
-                          <w:rFonts w:ascii="Aptos Display" w:hAnsi="Aptos Display"/>
-                        </w:rPr>
-                        <w:t>:</w:t>
-                      </w:r>
-                      <w:r>
-                        <w:rPr>
-                          <w:rFonts w:ascii="Aptos Display" w:hAnsi="Aptos Display"/>
-                        </w:rPr>
-                        <w:t xml:space="preserve"> </w:t>
-                      </w:r>
-                      <w:r>
-                        <w:rPr>
-                          <w:rFonts w:ascii="Aptos Display" w:hAnsi="Aptos Display"/>
-                        </w:rPr>
-                        <w:t xml:space="preserve">000 - </w:t>
-                      </w:r>
-                      <w:proofErr w:type="gramStart"/>
-                      <w:r>
-                        <w:rPr>
-                          <w:rFonts w:ascii="Aptos Display" w:hAnsi="Aptos Display"/>
-                        </w:rPr>
-                        <w:t xml:space="preserve">{{ </w:t>
-                      </w:r>
-                      <w:proofErr w:type="spellStart"/>
-                      <w:r>
-                        <w:rPr>
-                          <w:rFonts w:ascii="Aptos Display" w:hAnsi="Aptos Display"/>
-                        </w:rPr>
-                        <w:t>p</w:t>
-                      </w:r>
-                      <w:r>
-                        <w:rPr>
-                          <w:rFonts w:ascii="Aptos Display" w:hAnsi="Aptos Display"/>
-                        </w:rPr>
-                        <w:t>id</w:t>
-                      </w:r>
-                      <w:proofErr w:type="spellEnd"/>
-                      <w:proofErr w:type="gramEnd"/>
-                      <w:r>
-                        <w:rPr>
-                          <w:rFonts w:ascii="Aptos Display" w:hAnsi="Aptos Display"/>
-                        </w:rPr>
-                        <w:t xml:space="preserve"> }}</w:t>
-                      </w:r>
-                    </w:p>
-                    <w:p>
-                      <w:pPr>
-                        <w:ind w:firstLine="708"/>
-                      </w:pPr>
-                      <w:r>
-                        <w:rPr>
-                          <w:rFonts w:ascii="Aptos Display" w:hAnsi="Aptos Display"/>
-                          <w:b/>
-                          <w:bCs/>
-                        </w:rPr>
-                        <w:t>Fecha</w:t>
-                      </w:r>
-                      <w:r>
-                        <w:rPr>
-                          <w:rFonts w:ascii="Aptos Display" w:hAnsi="Aptos Display"/>
-                          <w:b/>
-                          <w:bCs/>
-                        </w:rPr>
-                        <w:t>:</w:t>
-                      </w:r>
-                      <w:r>
-                        <w:rPr>
-                          <w:rFonts w:ascii="Aptos Display" w:hAnsi="Aptos Display"/>
-                        </w:rPr>
-                        <w:t xml:space="preserve"> </w:t>
-                      </w:r>
-                      <w:proofErr w:type="gramStart"/>
-                      <w:r>
-                        <w:rPr>
-                          <w:rFonts w:ascii="Aptos Display" w:hAnsi="Aptos Display"/>
-                        </w:rPr>
-                        <w:t>{{ d</w:t>
-                      </w:r>
-                      <w:proofErr w:type="gramEnd"/>
-                      <w:r>
-                        <w:rPr>
-                          <w:rFonts w:ascii="Aptos Display" w:hAnsi="Aptos Display"/>
-                        </w:rPr>
-                        <w:t xml:space="preserve"> }} / </w:t>
-                      </w:r>
-                      <w:proofErr w:type="gramStart"/>
-                      <w:r>
-                        <w:rPr>
-                          <w:rFonts w:ascii="Aptos Display" w:hAnsi="Aptos Display"/>
-                        </w:rPr>
-                        <w:t>{{ m</w:t>
-                      </w:r>
-                      <w:proofErr w:type="gramEnd"/>
-                      <w:r>
-                        <w:rPr>
-                          <w:rFonts w:ascii="Aptos Display" w:hAnsi="Aptos Display"/>
-                        </w:rPr>
-                        <w:t xml:space="preserve"> }} / </w:t>
-                      </w:r>
-                      <w:proofErr w:type="gramStart"/>
-                      <w:r>
-                        <w:rPr>
-                          <w:rFonts w:ascii="Aptos Display" w:hAnsi="Aptos Display"/>
-                        </w:rPr>
-                        <w:t>{{ y</w:t>
-                      </w:r>
-                      <w:proofErr w:type="gramEnd"/>
-                      <w:r>
-                        <w:rPr>
-                          <w:rFonts w:ascii="Aptos Display" w:hAnsi="Aptos Display"/>
-                        </w:rPr>
-                        <w:t xml:space="preserve"> }}</w:t>
-                      </w:r>
-                    </w:p>
-                  </w:txbxContent>
-                </v:textbox>
-                <w10:wrap type="topAndBottom" anchory="page"/>
-              </v:shape>
-            </w:pict>
-          </mc:Fallback>
-        </mc:AlternateContent>
-      </w:r>
-      <w:r>
-        <w:rPr>
-          <w:noProof/>
-        </w:rPr>
-        <w:drawing>
-          <wp:anchor distT="0" distB="0" distL="114300" distR="114300" simplePos="0" relativeHeight="251662336" behindDoc="0" locked="0" layoutInCell="1" allowOverlap="1" wp14:anchorId="75DB1D37" wp14:editId="5094612A">
-            <wp:simplePos x="0" y="0"/>
-            <wp:positionH relativeFrom="column">
-              <wp:posOffset>1405585</wp:posOffset>
-            </wp:positionH>
-            <wp:positionV relativeFrom="page">
-              <wp:posOffset>1212571</wp:posOffset>
-            </wp:positionV>
-            <wp:extent cx="162560" cy="162560"/>
-            <wp:effectExtent l="0" t="0" r="8890" b="8890"/>
-            <wp:wrapTopAndBottom/>
-            <wp:docPr id="1265685533" name="Gráfico 3" descr="Teléfono"/>
-            <wp:cNvGraphicFramePr>
-              <a:graphicFrameLocks xmlns:a="http://schemas.openxmlformats.org/drawingml/2006/main" noChangeAspect="1"/>
-            </wp:cNvGraphicFramePr>
-            <a:graphic xmlns:a="http://schemas.openxmlformats.org/drawingml/2006/main">
-              <a:graphicData uri="http://schemas.openxmlformats.org/drawingml/2006/picture">
-                <pic:pic xmlns:pic="http://schemas.openxmlformats.org/drawingml/2006/picture">
-                  <pic:nvPicPr>
-                    <pic:cNvPr id="1265685533" name="Gráfico 1265685533" descr="Teléfono"/>
-                    <pic:cNvPicPr/>
-                  </pic:nvPicPr>
-                  <pic:blipFill>
-                    <a:blip r:embed="rId6">
-                      <a:extLst>
-                        <a:ext uri="{96DAC541-7B7A-43D3-8B79-37D633B846F1}">
-                          <asvg:svgBlip xmlns:asvg="http://schemas.microsoft.com/office/drawing/2016/SVG/main" r:embed="rId7"/>
-                        </a:ext>
-                      </a:extLst>
-                    </a:blip>
-                    <a:stretch>
-                      <a:fillRect/>
-                    </a:stretch>
-                  </pic:blipFill>
-                  <pic:spPr>
-                    <a:xfrm>
-                      <a:off x="0" y="0"/>
-                      <a:ext cx="162560" cy="162560"/>
-                    </a:xfrm>
-                    <a:prstGeom prst="rect">
-                      <a:avLst/>
-                    </a:prstGeom>
-                  </pic:spPr>
-                </pic:pic>
-              </a:graphicData>
-            </a:graphic>
-            <wp14:sizeRelH relativeFrom="margin">
-              <wp14:pctWidth>0</wp14:pctWidth>
-            </wp14:sizeRelH>
-            <wp14:sizeRelV relativeFrom="margin">
-              <wp14:pctHeight>0</wp14:pctHeight>
-            </wp14:sizeRelV>
-          </wp:anchor>
-        </w:drawing>
-      </w:r>
-      <w:r>
-        <w:rPr>
-          <w:noProof/>
-        </w:rPr>
-        <mc:AlternateContent>
-          <mc:Choice Requires="wps">
-            <w:drawing>
-              <wp:anchor distT="45720" distB="45720" distL="114300" distR="114300" simplePos="0" relativeHeight="251661312" behindDoc="0" locked="0" layoutInCell="1" allowOverlap="1" wp14:anchorId="13212A58" wp14:editId="3FFB2328">
-                <wp:simplePos x="0" y="0"/>
-                <wp:positionH relativeFrom="column">
-                  <wp:posOffset>648792</wp:posOffset>
-                </wp:positionH>
-                <wp:positionV relativeFrom="page">
-                  <wp:posOffset>299262</wp:posOffset>
-                </wp:positionV>
-                <wp:extent cx="2486025" cy="1452245"/>
-                <wp:effectExtent l="0" t="0" r="28575" b="14605"/>
-                <wp:wrapSquare wrapText="bothSides"/>
-                <wp:docPr id="1801446025" name="Cuadro de texto 2"/>
-                <wp:cNvGraphicFramePr>
-                  <a:graphicFrameLocks xmlns:a="http://schemas.openxmlformats.org/drawingml/2006/main"/>
-                </wp:cNvGraphicFramePr>
-                <a:graphic xmlns:a="http://schemas.openxmlformats.org/drawingml/2006/main">
-                  <a:graphicData uri="http://schemas.microsoft.com/office/word/2010/wordprocessingShape">
-                    <wps:wsp>
-                      <wps:cNvSpPr txBox="1">
-                        <a:spLocks noChangeArrowheads="1"/>
-                      </wps:cNvSpPr>
-                      <wps:spPr bwMode="auto">
-                        <a:xfrm>
-                          <a:off x="0" y="0"/>
-                          <a:ext cx="2486025" cy="1452245"/>
-                        </a:xfrm>
-                        <a:prstGeom prst="rect">
-                          <a:avLst/>
-                        </a:prstGeom>
-                        <a:ln>
-                          <a:solidFill>
-                            <a:schemeClr val="bg1"/>
-                          </a:solidFill>
-                          <a:headEnd/>
-                          <a:tailEnd/>
-                        </a:ln>
-                      </wps:spPr>
-                      <wps:style>
-                        <a:lnRef idx="2">
-                          <a:schemeClr val="dk1"/>
-                        </a:lnRef>
-                        <a:fillRef idx="1">
-                          <a:schemeClr val="lt1"/>
-                        </a:fillRef>
-                        <a:effectRef idx="0">
-                          <a:schemeClr val="dk1"/>
-                        </a:effectRef>
-                        <a:fontRef idx="minor">
-                          <a:schemeClr val="dk1"/>
-                        </a:fontRef>
-                      </wps:style>
-                      <wps:txbx>
-                        <w:txbxContent>
-                          <w:p>
-                            <w:pPr>
-                              <w:spacing w:line="240" w:lineRule="auto"/>
-                              <w:jc w:val="center"/>
-                              <w:rPr>
-                                <w:rFonts w:ascii="Aptos Display" w:hAnsi="Aptos Display"/>
-                              </w:rPr>
-                            </w:pPr>
-                            <w:r>
-                              <w:rPr>
-                                <w:rFonts w:ascii="Aptos Display" w:hAnsi="Aptos Display"/>
-                                <w:b/>
-                                <w:bCs/>
-                                <w:i/>
-                                <w:iCs/>
-                              </w:rPr>
-                              <w:t>SERVICE DE MOTOS Y CUATRICICLOS</w:t>
-                            </w:r>
-                            <w:r>
-                              <w:rPr>
-                                <w:rFonts w:ascii="Aptos Display" w:hAnsi="Aptos Display"/>
-                                <w:b/>
-                                <w:bCs/>
-                                <w:i/>
-                                <w:iCs/>
-                              </w:rPr>
-                              <w:br/>
-                            </w:r>
-                            <w:r>
-                              <w:rPr>
-                                <w:rFonts w:ascii="Aptos Display" w:hAnsi="Aptos Display"/>
-                                <w:b/>
-                                <w:bCs/>
-                                <w:i/>
-                                <w:iCs/>
-                              </w:rPr>
-                              <w:br/>
-                            </w:r>
-                            <w:r>
-                              <w:rPr>
-                                <w:rFonts w:ascii="Aptos Display" w:hAnsi="Aptos Display"/>
-                              </w:rPr>
-                              <w:t>Crisologo Larralde 179</w:t>
-                            </w:r>
-                            <w:r>
-                              <w:rPr>
-                                <w:rFonts w:ascii="Aptos Display" w:hAnsi="Aptos Display"/>
-                              </w:rPr>
-                              <w:br/>
-                              <w:t>Piñeiro, Avellaneda – Provincia de Bs. As</w:t>
-                            </w:r>
-                            <w:r>
-                              <w:rPr>
-                                <w:rFonts w:ascii="Aptos Display" w:hAnsi="Aptos Display"/>
-                              </w:rPr>
-                              <w:br/>
-                            </w:r>
-                            <w:r>
-                              <w:rPr>
-                                <w:rFonts w:ascii="Aptos Display" w:hAnsi="Aptos Display"/>
-                              </w:rPr>
-                              <w:br/>
-                              <w:t>2148-5227</w:t>
-                            </w:r>
-                            <w:r>
-                              <w:rPr>
-                                <w:rFonts w:ascii="Aptos Display" w:hAnsi="Aptos Display"/>
-                              </w:rPr>
-                              <w:br/>
-                            </w:r>
-                            <w:r>
-                              <w:rPr>
-                                <w:rFonts w:ascii="Aptos Display" w:hAnsi="Aptos Display"/>
-                                <w:b/>
-                                <w:bCs/>
-                                <w:i/>
-                                <w:iCs/>
-                              </w:rPr>
-                              <w:t>taller1028@hotmail.com</w:t>
-                            </w:r>
-                          </w:p>
-                        </w:txbxContent>
-                      </wps:txbx>
-                      <wps:bodyPr rot="0" vert="horz" wrap="square" lIns="91440" tIns="45720" rIns="91440" bIns="45720" anchor="t" anchorCtr="0">
-                        <a:noAutofit/>
-                      </wps:bodyPr>
-                    </wps:wsp>
-                  </a:graphicData>
-                </a:graphic>
-                <wp14:sizeRelH relativeFrom="margin">
-                  <wp14:pctWidth>0</wp14:pctWidth>
-                </wp14:sizeRelH>
-                <wp14:sizeRelV relativeFrom="margin">
-                  <wp14:pctHeight>0</wp14:pctHeight>
-                </wp14:sizeRelV>
-              </wp:anchor>
-            </w:drawing>
-          </mc:Choice>
-          <mc:Fallback>
-            <w:pict>
-              <v:shape w14:anchorId="13212A58" id="_x0000_s1030" type="#_x0000_t202" style="position:absolute;margin-left:51.1pt;margin-top:23.55pt;width:195.75pt;height:114.35pt;z-index:251661312;visibility:visible;mso-wrap-style:square;mso-width-percent:0;mso-height-percent:0;mso-wrap-distance-left:9pt;mso-wrap-distance-top:3.6pt;mso-wrap-distance-right:9pt;mso-wrap-distance-bottom:3.6pt;mso-position-horizontal:absolute;mso-position-horizontal-relative:text;mso-position-vertical:absolute;mso-position-vertical-relative:page;mso-width-percent:0;mso-height-percent:0;mso-width-relative:margin;mso-height-relative:margin;v-text-anchor:top" o:gfxdata="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" fillcolor="white [3201]" strokecolor="white [3212]" strokeweight="1pt">
-                <v:textbox>
-                  <w:txbxContent>
-                    <w:p>
-                      <w:pPr>
-                        <w:spacing w:line="240" w:lineRule="auto"/>
-                        <w:jc w:val="center"/>
-                        <w:rPr>
-                          <w:rFonts w:ascii="Aptos Display" w:hAnsi="Aptos Display"/>
-                        </w:rPr>
-                      </w:pPr>
-                      <w:r>
-                        <w:rPr>
-                          <w:rFonts w:ascii="Aptos Display" w:hAnsi="Aptos Display"/>
-                          <w:b/>
-                          <w:bCs/>
-                          <w:i/>
-                          <w:iCs/>
-                        </w:rPr>
-                        <w:t>SERVICE DE MOTOS Y CUATRICICLOS</w:t>
-                      </w:r>
-                      <w:r>
-                        <w:rPr>
-                          <w:rFonts w:ascii="Aptos Display" w:hAnsi="Aptos Display"/>
-                          <w:b/>
-                          <w:bCs/>
-                          <w:i/>
-                          <w:iCs/>
-                        </w:rPr>
-                        <w:br/>
-                      </w:r>
-                      <w:r>
-                        <w:rPr>
-                          <w:rFonts w:ascii="Aptos Display" w:hAnsi="Aptos Display"/>
-                          <w:b/>
-                          <w:bCs/>
-                          <w:i/>
-                          <w:iCs/>
-                        </w:rPr>
-                        <w:br/>
-                      </w:r>
-                      <w:r>
-                        <w:rPr>
-                          <w:rFonts w:ascii="Aptos Display" w:hAnsi="Aptos Display"/>
-                        </w:rPr>
-                        <w:t>Crisologo Larralde 179</w:t>
-                      </w:r>
-                      <w:r>
-                        <w:rPr>
-                          <w:rFonts w:ascii="Aptos Display" w:hAnsi="Aptos Display"/>
-                        </w:rPr>
-                        <w:br/>
-                        <w:t>Piñeiro, Avellaneda – Provincia de Bs. As</w:t>
-                      </w:r>
-                      <w:r>
-                        <w:rPr>
-                          <w:rFonts w:ascii="Aptos Display" w:hAnsi="Aptos Display"/>
-                        </w:rPr>
-                        <w:br/>
-                      </w:r>
-                      <w:r>
-                        <w:rPr>
-                          <w:rFonts w:ascii="Aptos Display" w:hAnsi="Aptos Display"/>
-                        </w:rPr>
-                        <w:br/>
-                        <w:t>2148-5227</w:t>
-                      </w:r>
-                      <w:r>
-                        <w:rPr>
-                          <w:rFonts w:ascii="Aptos Display" w:hAnsi="Aptos Display"/>
-                        </w:rPr>
-                        <w:br/>
-                      </w:r>
-                      <w:r>
-                        <w:rPr>
-                          <w:rFonts w:ascii="Aptos Display" w:hAnsi="Aptos Display"/>
-                          <w:b/>
-                          <w:bCs/>
-                          <w:i/>
-                          <w:iCs/>
-                        </w:rPr>
-                        <w:t>taller1028@hotmail.com</w:t>
-                      </w:r>
-                    </w:p>
-                  </w:txbxContent>
-                </v:textbox>
-                <w10:wrap type="square" anchory="page"/>
               </v:shape>
             </w:pict>
           </mc:Fallback>
@@ -4483,10 +4619,10 @@
                                 </w14:textOutline>
                               </w:rPr>
                               <w:drawing>
-                                <wp:inline distT="0" distB="0" distL="0" distR="0" wp14:anchorId="49E1957C" wp14:editId="6E3081F2">
-                                  <wp:extent cx="1224501" cy="1224501"/>
+                                <wp:inline distT="0" distB="0" distL="0" distR="0" wp14:anchorId="0C71F5DC" wp14:editId="2414FCFF">
+                                  <wp:extent cx="2393343" cy="1279785"/>
                                   <wp:effectExtent l="0" t="0" r="0" b="0"/>
-                                  <wp:docPr id="762820584" name="Imagen 1"/>
+                                  <wp:docPr id="151437379" name="Imagen 13"/>
                                   <wp:cNvGraphicFramePr>
                                     <a:graphicFrameLocks xmlns:a="http://schemas.openxmlformats.org/drawingml/2006/main" noChangeAspect="1"/>
                                   </wp:cNvGraphicFramePr>
@@ -4515,7 +4651,7 @@
                                         <pic:spPr bwMode="auto">
                                           <a:xfrm>
                                             <a:off x="0" y="0"/>
-                                            <a:ext cx="1226281" cy="1226281"/>
+                                            <a:ext cx="2547679" cy="1362313"/>
                                           </a:xfrm>
                                           <a:prstGeom prst="rect">
                                             <a:avLst/>
@@ -4603,10 +4739,10 @@
                           </w14:textOutline>
                         </w:rPr>
                         <w:drawing>
-                          <wp:inline distT="0" distB="0" distL="0" distR="0" wp14:anchorId="49E1957C" wp14:editId="6E3081F2">
-                            <wp:extent cx="1224501" cy="1224501"/>
+                          <wp:inline distT="0" distB="0" distL="0" distR="0" wp14:anchorId="0C71F5DC" wp14:editId="2414FCFF">
+                            <wp:extent cx="2393343" cy="1279785"/>
                             <wp:effectExtent l="0" t="0" r="0" b="0"/>
-                            <wp:docPr id="762820584" name="Imagen 1"/>
+                            <wp:docPr id="151437379" name="Imagen 13"/>
                             <wp:cNvGraphicFramePr>
                               <a:graphicFrameLocks xmlns:a="http://schemas.openxmlformats.org/drawingml/2006/main" noChangeAspect="1"/>
                             </wp:cNvGraphicFramePr>
@@ -4635,7 +4771,7 @@
                                   <pic:spPr bwMode="auto">
                                     <a:xfrm>
                                       <a:off x="0" y="0"/>
-                                      <a:ext cx="1226281" cy="1226281"/>
+                                      <a:ext cx="2547679" cy="1362313"/>
                                     </a:xfrm>
                                     <a:prstGeom prst="rect">
                                       <a:avLst/>
@@ -4689,80 +4825,10 @@
     <w:p/>
     <w:p/>
     <w:p/>
-    <w:p>
-      <w:r>
-        <w:rPr>
-          <w:noProof/>
-        </w:rPr>
-        <mc:AlternateContent>
-          <mc:Choice Requires="wps">
-            <w:drawing>
-              <wp:anchor distT="0" distB="0" distL="114300" distR="114300" simplePos="0" relativeHeight="251664384" behindDoc="0" locked="0" layoutInCell="1" allowOverlap="1" wp14:anchorId="08D985C9" wp14:editId="3B62B8BA">
-                <wp:simplePos x="0" y="0"/>
-                <wp:positionH relativeFrom="column">
-                  <wp:posOffset>3506470</wp:posOffset>
-                </wp:positionH>
-                <wp:positionV relativeFrom="page">
-                  <wp:posOffset>263118</wp:posOffset>
-                </wp:positionV>
-                <wp:extent cx="11430" cy="1515745"/>
-                <wp:effectExtent l="0" t="0" r="26670" b="27305"/>
-                <wp:wrapTopAndBottom/>
-                <wp:docPr id="1543018858" name="Conector recto 9"/>
-                <wp:cNvGraphicFramePr/>
-                <a:graphic xmlns:a="http://schemas.openxmlformats.org/drawingml/2006/main">
-                  <a:graphicData uri="http://schemas.microsoft.com/office/word/2010/wordprocessingShape">
-                    <wps:wsp>
-                      <wps:cNvCnPr/>
-                      <wps:spPr>
-                        <a:xfrm flipV="1">
-                          <a:off x="0" y="0"/>
-                          <a:ext cx="11430" cy="1515745"/>
-                        </a:xfrm>
-                        <a:prstGeom prst="line">
-                          <a:avLst/>
-                        </a:prstGeom>
-                      </wps:spPr>
-                      <wps:style>
-                        <a:lnRef idx="1">
-                          <a:schemeClr val="dk1"/>
-                        </a:lnRef>
-                        <a:fillRef idx="0">
-                          <a:schemeClr val="dk1"/>
-                        </a:fillRef>
-                        <a:effectRef idx="0">
-                          <a:schemeClr val="dk1"/>
-                        </a:effectRef>
-                        <a:fontRef idx="minor">
-                          <a:schemeClr val="tx1"/>
-                        </a:fontRef>
-                      </wps:style>
-                      <wps:bodyPr/>
-                    </wps:wsp>
-                  </a:graphicData>
-                </a:graphic>
-                <wp14:sizeRelH relativeFrom="margin">
-                  <wp14:pctWidth>0</wp14:pctWidth>
-                </wp14:sizeRelH>
-                <wp14:sizeRelV relativeFrom="margin">
-                  <wp14:pctHeight>0</wp14:pctHeight>
-                </wp14:sizeRelV>
-              </wp:anchor>
-            </w:drawing>
-          </mc:Choice>
-          <mc:Fallback>
-            <w:pict>
-              <v:line w14:anchorId="2D374B6F" id="Conector recto 9" o:spid="_x0000_s1026" style="position:absolute;flip:y;z-index:251664384;visibility:visible;mso-wrap-style:square;mso-width-percent:0;mso-height-percent:0;mso-wrap-distance-left:9pt;mso-wrap-distance-top:0;mso-wrap-distance-right:9pt;mso-wrap-distance-bottom:0;mso-position-horizontal:absolute;mso-position-horizontal-relative:text;mso-position-vertical:absolute;mso-position-vertical-relative:page;mso-width-percent:0;mso-height-percent:0;mso-width-relative:margin;mso-height-relative:margin" from="276.1pt,20.7pt" to="277pt,140.05pt" o:gfxdata="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" strokecolor="black [3200]" strokeweight=".5pt">
-                <v:stroke joinstyle="miter"/>
-                <w10:wrap type="topAndBottom" anchory="page"/>
-              </v:line>
-            </w:pict>
-          </mc:Fallback>
-        </mc:AlternateContent>
-      </w:r>
-    </w:p>
+    <w:p/>
     <w:p/>
     <w:sectPr>
+      <w:footerReference w:type="default" r:id="rId9"/>
       <w:pgSz w:w="11906" w:h="16838"/>
       <w:pgMar w:top="1417" w:right="1701" w:bottom="1417" w:left="1701" w:header="708" w:footer="708" w:gutter="0"/>
       <w:cols w:space="708"/>
@@ -4795,6 +4861,113 @@
     </w:p>
   </w:endnote>
 </w:endnotes>
+</file>
+
+<file path=word/footer1.xml><?xml version="1.0" encoding="utf-8"?>
+<w:ftr xmlns:wpc="http://schemas.microsoft.com/office/word/2010/wordprocessingCanvas" xmlns:cx="http://schemas.microsoft.com/office/drawing/2014/chartex" xmlns:cx1="http://schemas.microsoft.com/office/drawing/2015/9/8/chartex" xmlns:cx2="http://schemas.microsoft.com/office/drawing/2015/10/21/chartex" xmlns:cx3="http://schemas.microsoft.com/office/drawing/2016/5/9/chartex" xmlns:cx4="http://schemas.microsoft.com/office/drawing/2016/5/10/chartex" xmlns:cx5="http://schemas.microsoft.com/office/drawing/2016/5/11/chartex" xmlns:cx6="http://schemas.microsoft.com/office/drawing/2016/5/12/chartex" xmlns:cx7="http://schemas.microsoft.com/office/drawing/2016/5/13/chartex" xmlns:cx8="http://schemas.microsoft.com/office/drawing/2016/5/14/chartex" xmlns:mc="http://schemas.openxmlformats.org/markup-compatibility/2006" xmlns:aink="http://schemas.microsoft.com/office/drawing/2016/ink" xmlns:am3d="http://schemas.microsoft.com/office/drawing/2017/model3d" xmlns:o="urn:schemas-microsoft-com:office:office" xmlns:oel="http://schemas.microsoft.com/office/2019/extlst" xmlns:r="http://schemas.openxmlformats.org/officeDocument/2006/relationships" xmlns:m="http://schemas.openxmlformats.org/officeDocument/2006/math" xmlns:v="urn:schemas-microsoft-com:vml" xmlns:wp14="http://schemas.microsoft.com/office/word/2010/wordprocessingDrawing" xmlns:wp="http://schemas.openxmlformats.org/drawingml/2006/wordprocessingDrawing" xmlns:w10="urn:schemas-microsoft-com:office:word" xmlns:w="http://schemas.openxmlformats.org/wordprocessingml/2006/main" xmlns:w14="http://schemas.microsoft.com/office/word/2010/wordml" xmlns:w15="http://schemas.microsoft.com/office/word/2012/wordml" xmlns:w16cex="http://schemas.microsoft.com/office/word/2018/wordml/cex" xmlns:w16cid="http://schemas.microsoft.com/office/word/2016/wordml/cid" xmlns:w16="http://schemas.microsoft.com/office/word/2018/wordml" xmlns:w16du="http://schemas.microsoft.com/office/word/2023/wordml/word16du" xmlns:w16sdtdh="http://schemas.microsoft.com/office/word/2020/wordml/sdtdatahash" xmlns:w16sdtfl="http://schemas.microsoft.com/office/word/2024/wordml/sdtformatlock" xmlns:w16se="http://schemas.microsoft.com/office/word/2015/wordml/symex" xmlns:wpg="http://schemas.microsoft.com/office/word/2010/wordprocessingGroup" xmlns:wpi="http://schemas.microsoft.com/office/word/2010/wordprocessingInk" xmlns:wne="http://schemas.microsoft.com/office/word/2006/wordml" xmlns:wps="http://schemas.microsoft.com/office/word/2010/wordprocessingShape" mc:Ignorable="w14 w15 w16se w16cid w16 w16cex w16sdtdh w16sdtfl w16du wp14">
+  <w:p>
+    <w:pPr>
+      <w:pStyle w:val="Piedepgina"/>
+      <w:tabs>
+        <w:tab w:val="clear" w:pos="8504"/>
+      </w:tabs>
+      <w:ind w:left="708" w:right="-1277"/>
+      <w:jc w:val="right"/>
+      <w:rPr>
+        <w:rFonts w:ascii="Aptos Display" w:hAnsi="Aptos Display"/>
+      </w:rPr>
+    </w:pPr>
+    <w:r>
+      <w:tab/>
+    </w:r>
+    <w:r>
+      <w:rPr>
+        <w:rFonts w:ascii="Aptos Display" w:hAnsi="Aptos Display"/>
+      </w:rPr>
+      <w:t>Nota: los precios incluyen IVA. Sujetos a modificación sin previo aviso.</w:t>
+    </w:r>
+  </w:p>
+  <w:p>
+    <w:pPr>
+      <w:pStyle w:val="Piedepgina"/>
+      <w:ind w:left="708" w:right="-1277"/>
+      <w:jc w:val="right"/>
+      <w:rPr>
+        <w:rFonts w:ascii="Aptos Display" w:hAnsi="Aptos Display"/>
+      </w:rPr>
+    </w:pPr>
+    <w:r>
+      <w:rPr>
+        <w:rFonts w:ascii="Aptos Display" w:hAnsi="Aptos Display"/>
+        <w:b/>
+        <w:bCs/>
+      </w:rPr>
+      <w:t>N°</w:t>
+    </w:r>
+    <w:r>
+      <w:rPr>
+        <w:rFonts w:ascii="Aptos Display" w:hAnsi="Aptos Display"/>
+      </w:rPr>
+      <w:t xml:space="preserve">: 000 - </w:t>
+    </w:r>
+    <w:proofErr w:type="gramStart"/>
+    <w:r>
+      <w:rPr>
+        <w:rFonts w:ascii="Aptos Display" w:hAnsi="Aptos Display"/>
+      </w:rPr>
+      <w:t xml:space="preserve">{{ </w:t>
+    </w:r>
+    <w:proofErr w:type="spellStart"/>
+    <w:r>
+      <w:rPr>
+        <w:rFonts w:ascii="Aptos Display" w:hAnsi="Aptos Display"/>
+      </w:rPr>
+      <w:t>pid</w:t>
+    </w:r>
+    <w:proofErr w:type="spellEnd"/>
+    <w:proofErr w:type="gramEnd"/>
+    <w:r>
+      <w:rPr>
+        <w:rFonts w:ascii="Aptos Display" w:hAnsi="Aptos Display"/>
+      </w:rPr>
+      <w:t xml:space="preserve"> }}</w:t>
+    </w:r>
+    <w:r>
+      <w:rPr>
+        <w:rFonts w:ascii="Aptos Display" w:hAnsi="Aptos Display"/>
+      </w:rPr>
+      <w:t xml:space="preserve"> – </w:t>
+    </w:r>
+    <w:proofErr w:type="gramStart"/>
+    <w:r>
+      <w:rPr>
+        <w:rFonts w:ascii="Aptos Display" w:hAnsi="Aptos Display"/>
+      </w:rPr>
+      <w:t>{{ m</w:t>
+    </w:r>
+    <w:proofErr w:type="gramEnd"/>
+    <w:r>
+      <w:rPr>
+        <w:rFonts w:ascii="Aptos Display" w:hAnsi="Aptos Display"/>
+      </w:rPr>
+      <w:t xml:space="preserve"> </w:t>
+    </w:r>
+    <w:proofErr w:type="gramStart"/>
+    <w:r>
+      <w:rPr>
+        <w:rFonts w:ascii="Aptos Display" w:hAnsi="Aptos Display"/>
+      </w:rPr>
+      <w:t>}}/{{ y</w:t>
+    </w:r>
+    <w:proofErr w:type="gramEnd"/>
+    <w:r>
+      <w:rPr>
+        <w:rFonts w:ascii="Aptos Display" w:hAnsi="Aptos Display"/>
+      </w:rPr>
+      <w:t xml:space="preserve"> }}</w:t>
+    </w:r>
+  </w:p>
+</w:ftr>
 </file>
 
 <file path=word/footnotes.xml><?xml version="1.0" encoding="utf-8"?>
@@ -5426,7 +5599,6 @@
   <w:style w:type="character" w:default="1" w:styleId="Fuentedeprrafopredeter">
     <w:name w:val="Default Paragraph Font"/>
     <w:uiPriority w:val="1"/>
-    <w:semiHidden/>
     <w:unhideWhenUsed/>
   </w:style>
   <w:style w:type="table" w:default="1" w:styleId="Tablanormal">

</xml_diff>